<commit_message>
Your First Book That Sells: remove example names and own-title examples; fix 70% royalty math, ACOS example, cross-references; trim Part I/full-guide duplicates; rebuild master
</commit_message>
<xml_diff>
--- a/Your First Book That Sells/Your First Book That Sells.docx
+++ b/Your First Book That Sells/Your First Book That Sells.docx
@@ -95,7 +95,7 @@
             <w:color w:val="0C2D5A"/>
             <w:u w:val="single"/>
           </w:rPr>
-          <w:t xml:space="preserve">Part I — The Short Road: One Month with June</w:t>
+          <w:t xml:space="preserve">Part I — The Short Road: One Month with One Book</w:t>
         </w:r>
       </w:hyperlink>
     </w:p>
@@ -778,7 +778,7 @@
     </w:p>
     <w:p>
       <w:r>
-        <w:t>Part I is the short road. You follow June, a first-time mystery author, through one month of real decisions: what to write, who it is for, what one sale leaves her, how to fix the page, how to ask for honest reviews, and which of thirty-two money ideas to try first. Each chapter ends with one action. If you read only Part I, you can publish a book that pays you honestly.</w:t>
+        <w:t>Part I is the short road. You follow one first-time author and her cozy mystery through one month of real decisions: what to write, who it is for, what one sale leaves her, how to fix the page, how to ask for honest reviews, and which of thirty-two money ideas to try first. Each chapter ends with one action. If you read only Part I, you can publish a book that pays you honestly.</w:t>
       </w:r>
     </w:p>
     <w:p>
@@ -797,7 +797,7 @@
         <w:pStyle w:val="Heading1"/>
       </w:pPr>
       <w:r>
-        <w:t>Part I — The Short Road: One Month with June</w:t>
+        <w:t>Part I — The Short Road: One Month with One Book</w:t>
       </w:r>
       <w:bookmarkEnd w:id="2"/>
     </w:p>
@@ -811,7 +811,7 @@
     </w:p>
     <w:p>
       <w:r>
-        <w:t>June has a finished mystery and a price of $0.99 in her head. She has not asked what one sale would leave her. Part I is the month she finds out. Parts II to VIII are the full guide, with every number worked out.</w:t>
+        <w:t>Picture a first-time author with a finished cozy mystery and a price of $0.99 in her head. She has not asked what one sale would leave her. Part I is the month she finds out. She is a teaching example, not a real person, and every number in her month is a practice sum. Parts II to VIII are the full guide, with every number worked out.</w:t>
       </w:r>
     </w:p>
     <w:p>
@@ -859,7 +859,7 @@
     </w:p>
     <w:p>
       <w:r>
-        <w:t>If a line is blank, do not pay for an ad, a promotion, or a stack of free copies. At each later decision the book fills the three lines with June’s numbers, so you can see the test instead of only the instruction.</w:t>
+        <w:t>If a line is blank, do not pay for an ad, a promotion, or a stack of free copies. At each later decision the book fills the three lines with the example author’s numbers, so you can see the test instead of only the instruction.</w:t>
       </w:r>
     </w:p>
     <w:p>
@@ -913,22 +913,22 @@
     </w:p>
     <w:p>
       <w:r>
-        <w:t>June’s book is a mystery. She calls it The Guest on Sunday. Maren is her detective. One ferry office, one missing guest, one week. That is a form. If your book is also one kind of thing, write the sentence you could print under the title and go to chapter 2.</w:t>
-      </w:r>
-    </w:p>
-    <w:p>
-      <w:r>
-        <w:t>June’s sentence is: a gentle mystery, a small town, no gore.</w:t>
-      </w:r>
-    </w:p>
-    <w:p>
-      <w:r>
-        <w:t>Then write one page for the path. What the reader knows at the start. What they know at the end. Fill the chapters inside that page. If you can retell the book by listing someone else’s chapters, you copied a table of contents. If you remember a clue from a book you admire, invent another. June’s chess piece has to be hers.</w:t>
-      </w:r>
-    </w:p>
-    <w:p>
-      <w:r>
-        <w:t>If you are not writing fiction, the same rule is stricter, and it is a note, not the door of this book. A textbook needs one meaning per word, a result the reader can use, and practice. A popular explanation needs a voice and a path a person can leave. Do not mix them in one file. Keep a familiar teaching order unless a different order teaches better. Then come back. The rest of this book is how the book, whichever kind it is, gets paid for.</w:t>
+        <w:t>The example book is a cozy mystery. One ferry office, one missing guest, one week, and the woman who keeps the office has to solve it. That is a form. If your book is also one kind of thing, write the sentence you could print under the title and go to chapter 2.</w:t>
+      </w:r>
+    </w:p>
+    <w:p>
+      <w:r>
+        <w:t>The author’s sentence is: a gentle mystery, a small town, no gore.</w:t>
+      </w:r>
+    </w:p>
+    <w:p>
+      <w:r>
+        <w:t>Then write one page for the path. What the reader knows at the start. What they know at the end. Fill the chapters inside that page. If you can retell the book by listing someone else’s chapters, you copied a table of contents. If you remember a clue from a book you admire, invent another. The chess piece the guest leaves behind in the example has to be the author’s own idea.</w:t>
+      </w:r>
+    </w:p>
+    <w:p>
+      <w:r>
+        <w:t>If you are not writing fiction, the same rule is stricter, and it is a note, not the door of this book. A technical handbook needs one meaning per word, a result the reader can use, and practice. A cookbook needs recipes that work in an ordinary kitchen. A memoir or a popular explanation needs a voice and a path a person can leave. Do not mix them in one file. Keep a familiar teaching order unless a different order teaches better. Then come back. The rest of this book is how the book, whichever kind it is, gets paid for.</w:t>
       </w:r>
     </w:p>
     <w:p>
@@ -956,7 +956,7 @@
     </w:p>
     <w:p>
       <w:r>
-        <w:t>June is the author in the examples that follow. She begins the month at $0.99. She has two sentences to write before she is allowed to talk about price.</w:t>
+        <w:t>The mystery author is the example that runs through Part I. She begins the month at $0.99. She has two sentences to write before she is allowed to talk about price.</w:t>
       </w:r>
     </w:p>
     <w:p>
@@ -996,7 +996,7 @@
     </w:p>
     <w:p>
       <w:r>
-        <w:t>June looked at five books on 27 September 2026. These are teaching examples of a shelf, with ordinary prices, not a sale price. They are not a list to paste onto your own page.</w:t>
+        <w:t>She looks at five books on the shelf her reader already browses. These are invented titles, a teaching example of a shelf, with ordinary prices, not a sale price. They are not a list to paste onto your own page.</w:t>
       </w:r>
     </w:p>
     <w:p>
@@ -1026,7 +1026,7 @@
     </w:p>
     <w:p>
       <w:r>
-        <w:t>These are other people’s books. June’s own title is The Guest on Sunday, and it is not on this shelf. The phrases she later uses in an ad are words from these five titles: lakeside inn mystery, sleuth on the night desk, no gore in the village, the locked pantry, small town quiet case.</w:t>
+        <w:t>These stand for other people’s books, and her own title is not on this shelf. Another book’s title never goes in your keyword boxes. What she takes from the shelf is the words these books share and their readers use: small town cozy mystery, amateur sleuth inn mystery, clean mystery no gore, village puzzle mystery, quiet village detective. Those five phrases come back in chapter 5 and in the ad test.</w:t>
       </w:r>
     </w:p>
     <w:p>
@@ -1237,7 +1237,7 @@
     </w:p>
     <w:p>
       <w:r>
-        <w:t>Before you spend, fill June’s three lines with your own.</w:t>
+        <w:t>Before you spend, here are the example author’s three lines. Write your own beside them.</w:t>
       </w:r>
     </w:p>
     <w:p>
@@ -1297,12 +1297,12 @@
     </w:p>
     <w:p>
       <w:r>
-        <w:t>Here is the opening of June’s book, The Guest on Sunday. Maren is her detective. The inn on the comparison shelf belongs to someone else.</w:t>
-      </w:r>
-    </w:p>
-    <w:p>
-      <w:r>
-        <w:t>“Maren keeps the ferry office. When a guest vanishes and leaves a chess piece on the blotter, she has until Sunday to find him, without scaring off the wedding party in the dining room. A gentle mystery for readers who want a small town, a puzzle, and no gore.”</w:t>
+        <w:t>Here is the opening of the example mystery.</w:t>
+      </w:r>
+    </w:p>
+    <w:p>
+      <w:r>
+        <w:t>“The woman who keeps the ferry office knows every guest who comes and goes. When one vanishes and leaves a chess piece on the blotter, she has until Sunday to find him, without scaring off the wedding party in the dining room. A gentle mystery for readers who want a small town, a puzzle, and no gore.”</w:t>
       </w:r>
     </w:p>
     <w:p>
@@ -1330,7 +1330,7 @@
     </w:p>
     <w:p>
       <w:r>
-        <w:t>Show June’s two lines, or your own, to one stranger. If they cannot say who the book is for, fix the lines before you buy an ad.</w:t>
+        <w:t>Show your own two lines to one stranger. If they cannot say who the book is for, fix the lines before you buy an ad.</w:t>
       </w:r>
     </w:p>
     <w:p>
@@ -1365,7 +1365,7 @@
     </w:p>
     <w:p>
       <w:r>
-        <w:t>Keywords are the phrases a reader types. On the KDP details page you get a set of keyword boxes. Fill them with phrases, not single vague words like “book” or “fiction.” Use words a reader would type, the way June’s phrases are words from the titles in chapter 2. Do not repeat the title in every box. Do not type claims you cannot stand behind, such as “bestseller” or “guaranteed income.” If the form on the page has changed since 1 October 2026, follow the form, not this paragraph.</w:t>
+        <w:t>Keywords are the phrases a reader types. On the KDP details page you get a set of keyword boxes. Fill them with phrases, not single vague words like “book” or “fiction.” Use words a reader would type, the way the mystery author’s phrases are the words her shelf shares in chapter 2. Never type another author’s name or another book’s title; chapter 22 explains why. Do not repeat the title in every box. Do not type claims you cannot stand behind, such as “bestseller” or “guaranteed income.” If the form on the page has changed since 1 October 2026, follow the form, not this paragraph.</w:t>
       </w:r>
     </w:p>
     <w:p>
@@ -1380,27 +1380,27 @@
     </w:p>
     <w:p>
       <w:r>
-        <w:t>lakeside inn mystery</w:t>
-      </w:r>
-    </w:p>
-    <w:p>
-      <w:r>
-        <w:t>sleuth on the night desk</w:t>
-      </w:r>
-    </w:p>
-    <w:p>
-      <w:r>
-        <w:t>no gore in the village</w:t>
-      </w:r>
-    </w:p>
-    <w:p>
-      <w:r>
-        <w:t>the locked pantry</w:t>
-      </w:r>
-    </w:p>
-    <w:p>
-      <w:r>
-        <w:t>small town quiet case</w:t>
+        <w:t>small town cozy mystery</w:t>
+      </w:r>
+    </w:p>
+    <w:p>
+      <w:r>
+        <w:t>amateur sleuth inn mystery</w:t>
+      </w:r>
+    </w:p>
+    <w:p>
+      <w:r>
+        <w:t>clean mystery no gore</w:t>
+      </w:r>
+    </w:p>
+    <w:p>
+      <w:r>
+        <w:t>village puzzle mystery</w:t>
+      </w:r>
+    </w:p>
+    <w:p>
+      <w:r>
+        <w:t>quiet village detective</w:t>
       </w:r>
     </w:p>
     <w:p>
@@ -1415,7 +1415,7 @@
     </w:p>
     <w:p>
       <w:r>
-        <w:t>None of those is the title. Each is a way a reader might search. If a phrase does not fit the book, it does not go in the box, even if it is popular.</w:t>
+        <w:t>None of those is her title or anyone else’s. Each is a way a reader might search. If a phrase does not fit the book, it does not go in the box, even if it is popular.</w:t>
       </w:r>
     </w:p>
     <w:p>
@@ -1478,7 +1478,7 @@
     </w:p>
     <w:p>
       <w:r>
-        <w:t>You may send a free advance copy. Say that a review is welcome and optional. Do not ask for stars. Do not offer a gift card, a refund, or a favor in exchange for a kind review. Amazon has said a free or discounted copy is allowed only when you do not require a review and do not try to steer it. Extra incentives can wipe out that exception. Read the current Customer Reviews page before you send the invitation. [1] [2] A reader on Amazon.com generally must have spent $50 with a credit or debit card in the past 12 months before they can post. Promotional discounts do not count toward that $50. A willing reader who has not spent that much still cannot post. That is the platform, not a failed invitation. You do not review your own book. A friend, relative, or business partner is a conflict, not a useful first review. [2]</w:t>
+        <w:t>You may send a free advance copy. Say that a review is welcome and optional. Do not ask for stars. Do not offer a gift card, a refund, or a favor in exchange for a kind review. Amazon has said a free or discounted copy is allowed only when you do not require a review and do not try to steer it. Extra incentives can wipe out that exception. Read the current Customer Reviews page before you send the invitation. [1] [2] Not every willing reader can post. Amazon.com sets a spending threshold for reviewers, so a missing review is often the platform, not a failed invitation. Chapter 31 has the full eligibility rules. You do not review your own book. A friend, relative, or business partner is a conflict, not a useful first review. [2]</w:t>
       </w:r>
     </w:p>
     <w:p>
@@ -1571,7 +1571,7 @@
     </w:p>
     <w:p>
       <w:r>
-        <w:t>June sent The Guest on Sunday to a man who had asked for a thriller. He wrote back that the chess piece wasted his evening. She had skipped the sentence about who the book is not for. The file cost her an hour and taught her nothing about Maren.</w:t>
+        <w:t>The mystery author sent her advance copy to a man who had asked for a thriller. He wrote back that the chess piece wasted his evening. She had skipped the sentence about who the book is not for. The file cost her an hour and taught her nothing about her book.</w:t>
       </w:r>
     </w:p>
     <w:p>
@@ -1586,7 +1586,7 @@
     </w:p>
     <w:p>
       <w:r>
-        <w:t>Before you spend, fill June’s three lines with your own.</w:t>
+        <w:t>Before you spend, here are the example author’s three lines. Write your own beside them.</w:t>
       </w:r>
     </w:p>
     <w:p>
@@ -1651,7 +1651,7 @@
     </w:p>
     <w:p>
       <w:r>
-        <w:t>Each idea below is three lines. What it is. The smallest version. The number that means stop. The keeps, when a line needs one, are the chapter 3 examples. After June raises her price, her ebook keep is about $2.58. Your file’s estimate wins over that round.</w:t>
+        <w:t>Each idea below is three lines. What it is. The smallest version. The number that means stop. The keeps, when a line needs one, are the chapter 3 examples. After the example author raises her price, her ebook keep is about $2.58. Your file’s estimate wins over that round.</w:t>
       </w:r>
     </w:p>
     <w:p>
@@ -1664,7 +1664,7 @@
     </w:p>
     <w:p>
       <w:r>
-        <w:t>A normal book belongs in the 70 percent band when you qualify. June’s test is $3.99, about $2.58 kept, against $0.99, about $0.35.</w:t>
+        <w:t>A normal book belongs in the 70 percent band when you qualify. The example test is $3.99, about $2.58 kept, against $0.99, about $0.35.</w:t>
       </w:r>
     </w:p>
     <w:p>
@@ -1687,7 +1687,7 @@
     </w:p>
     <w:p>
       <w:r>
-        <w:t>Book one can be the book a stranger tries. Book two is where the catalog pays. After June’s change, book one already keeps about $2.58. Do not cut it to make book two look expensive.</w:t>
+        <w:t>Book one can be the book a stranger tries. Book two is where the catalog pays. After the price change, book one already keeps about $2.58. Do not cut it to make book two look expensive.</w:t>
       </w:r>
     </w:p>
     <w:p>
@@ -1825,7 +1825,7 @@
     </w:p>
     <w:p>
       <w:r>
-        <w:t>Select is 90 days. Page reads may pay you. The ebook stays out of other stores. Amazon announces a fund each month and splits it across every page read in Kindle Unlimited. For July 2026 the fund was $67.6 million. Authors who track the payouts reported a per-page rate for that month of a little over four tenths of a cent, so a full read of a book that counts as 300 pages paid roughly $1.27. That is history, not a promise. The rate moves every month, and your own reports are the only number that counts for your book. [5] [10]</w:t>
+        <w:t>Select is 90 days. Page reads may pay you. The ebook stays out of other stores. For July 2026 the shared fund was $67.6 million, a little over four tenths of a cent per page, so a full read of a book that counts as 300 pages paid roughly $1.27. That is history, not a promise. Chapter 17 shows how the fund works and chapter 27 weighs it against selling everywhere. [5] [10]</w:t>
       </w:r>
     </w:p>
     <w:p>
@@ -2410,27 +2410,27 @@
     </w:p>
     <w:p>
       <w:r>
-        <w:t>Story A, the price. This is June, later in the same month. Her only book is $0.99. The KDP estimate says she keeps about $0.35. In four quiet weeks she sells 20 copies. Keep, about $7. She changes only the price, to $3.99. The estimate now says about $2.58. She does not touch the cover or the ad, because there is no ad. Over the next four weeks she sells 12 copies. Keep, about $31. Fewer sales, more money. She writes that on the sheet and holds the price for another four weeks before she believes it. If the second month collapses, she can go back. One change. One window.</w:t>
-      </w:r>
-    </w:p>
-    <w:p>
-      <w:r>
-        <w:t>Story B, the paperback. June’s ebook keeps about $2.58 at $3.99. She wants paper. The calculator says a 240-page paperback costs about $4 to print in her marketplace. She tries $14.99 at 60 percent: (0.60 × $14.99) − $4 is about $5. She does not list it at $9.99. At 60 percent, 0.60 × $9.99 is $5.99, minus $4 to print, about $2. The ebook keeps about $2.58. Paper at that price pays less, and it is a heavier object. She orders a proof, reads ten pages, and only then clicks publish. The print cost in this story is an illustration. Her calculator, not this paragraph, sets the real number.</w:t>
-      </w:r>
-    </w:p>
-    <w:p>
-      <w:r>
-        <w:t>Story C, the capped ad. June writes “keep about $2.58” at the top of a page. She sets a $40 cap and a stop date. She uses the five phrases from the titles in chapter 2: lakeside inn mystery, sleuth on the night desk, no gore in the village, the locked pantry, small town quiet case. After the cap, the screen shows clicks and two sales. Two times $2.58 is about $5, against $40 spent. She does not raise the budget. She rewrites the first two description lines, waits, and only then decides whether another $40 is a test or a habit.</w:t>
-      </w:r>
-    </w:p>
-    <w:p>
-      <w:r>
-        <w:t>Before you spend, fill June’s three lines with your own.</w:t>
-      </w:r>
-    </w:p>
-    <w:p>
-      <w:r>
-        <w:t>Keep: about $2.58 on The Guest on Sunday, now at $3.99.</w:t>
+        <w:t>Story A, the price. This is the mystery author, later in the same month. Her only book is $0.99. The KDP estimate says she keeps about $0.35. In four quiet weeks she sells 20 copies. Keep, about $7. She changes only the price, to $3.99. The estimate now says about $2.58. She does not touch the cover or the ad, because there is no ad. Over the next four weeks she sells 12 copies. Keep, about $31. Fewer sales, more money. She writes that on the sheet and holds the price for another four weeks before she believes it. If the second month collapses, she can go back. One change. One window.</w:t>
+      </w:r>
+    </w:p>
+    <w:p>
+      <w:r>
+        <w:t>Story B, the paperback. The same author’s ebook keeps about $2.58 at $3.99. She wants paper. The calculator says a 240-page paperback costs about $4 to print in her marketplace. She tries $14.99 at 60 percent: (0.60 × $14.99) − $4 is about $5. She does not list it at $9.99. At 60 percent, 0.60 × $9.99 is $5.99, minus $4 to print, about $2. The ebook keeps about $2.58. Paper at that price pays less, and it is a heavier object. She orders a proof, reads ten pages, and only then clicks publish. The print cost in this story is an illustration. Her calculator, not this paragraph, sets the real number.</w:t>
+      </w:r>
+    </w:p>
+    <w:p>
+      <w:r>
+        <w:t>Story C, the capped ad. The author writes “keep about $2.58” at the top of a page. She sets a $40 cap and a stop date. She uses the five reader phrases from chapter 2: small town cozy mystery, amateur sleuth inn mystery, clean mystery no gore, village puzzle mystery, quiet village detective. After the cap, the screen shows clicks and two sales. Two times $2.58 is about $5, against $40 spent. She does not raise the budget. She rewrites the first two description lines, waits, and only then decides whether another $40 is a test or a habit.</w:t>
+      </w:r>
+    </w:p>
+    <w:p>
+      <w:r>
+        <w:t>Before you spend, here are the example author’s three lines. Write your own beside them.</w:t>
+      </w:r>
+    </w:p>
+    <w:p>
+      <w:r>
+        <w:t>Keep: about $2.58 on the example mystery, now at $3.99.</w:t>
       </w:r>
     </w:p>
     <w:p>
@@ -2470,7 +2470,7 @@
     </w:p>
     <w:p>
       <w:r>
-        <w:t>Teaching example, after June’s price change. She keeps about $2.58 on a $3.99 sale. A click costs $0.30. If one sale comes from every ten clicks, the ad costs $3.00 to earn that $2.58. The click would have to cost about $0.26 or less to break even, because $2.58 × 0.10 = $0.26. At 5 percent, the ceiling is about $0.13. These are ceilings, not recommended bids. Refunds, delayed reports, and page-read money move the real result. Stay under the ceiling. Do not treat the sales number in an ad screen as the money you keep.</w:t>
+        <w:t>Teaching example, after the mystery author’s price change. She keeps about $2.58 on a $3.99 sale. A click costs $0.30. If one sale comes from every ten clicks, the ad costs $3.00 to earn that $2.58. The click would have to cost about $0.26 or less to break even, because $2.58 × 0.10 = $0.26. At 5 percent, the ceiling is about $0.13. These are ceilings, not recommended bids. Refunds, delayed reports, and page-read money move the real result. Stay under the ceiling. Do not treat the sales number in an ad screen as the money you keep. Chapter 25 turns the same test into break-even ACOS, the figure the ad screen shows.</w:t>
       </w:r>
     </w:p>
     <w:p>
@@ -2574,12 +2574,12 @@
     </w:p>
     <w:p>
       <w:r>
-        <w:t>Before you spend, fill June’s three lines with your own.</w:t>
-      </w:r>
-    </w:p>
-    <w:p>
-      <w:r>
-        <w:t>Keep: about $2.58 on The Guest on Sunday, now at $3.99.</w:t>
+        <w:t>Before you spend, here are the example author’s three lines. Write your own beside them.</w:t>
+      </w:r>
+    </w:p>
+    <w:p>
+      <w:r>
+        <w:t>Keep: about $2.58 on the example mystery, now at $3.99.</w:t>
       </w:r>
     </w:p>
     <w:p>
@@ -2619,7 +2619,7 @@
     </w:p>
     <w:p>
       <w:r>
-        <w:t>Teaching example, after the price change. 100 people buy book one at $3.99 and she keeps about $2.58, so those first sales keep about $258. Thirty of them later buy book two at the same keep, about $77. Together that is about $335, or about $3.35 per first buyer. Paying $2 to find one of those buyers can fit. Paying $4 does not.</w:t>
+        <w:t>Teaching example, after the price change. 100 people buy book one at $3.99 and the author keeps about $2.58, so those first sales keep about $258. Thirty of them later buy book two at the same keep, about $77. Together that is about $335, or about $3.35 per first buyer. Paying $2 to find one of those buyers can fit. Paying $4 does not.</w:t>
       </w:r>
     </w:p>
     <w:p>
@@ -2634,12 +2634,12 @@
     </w:p>
     <w:p>
       <w:r>
-        <w:t>Before you spend, fill June’s three lines with your own.</w:t>
-      </w:r>
-    </w:p>
-    <w:p>
-      <w:r>
-        <w:t>Keep: about $2.58 on The Guest on Sunday. Do not cut that price to advertise a book that does not exist.</w:t>
+        <w:t>Before you spend, here are the example author’s three lines. Write your own beside them.</w:t>
+      </w:r>
+    </w:p>
+    <w:p>
+      <w:r>
+        <w:t>Keep: about $2.58 on the example mystery. Do not cut that price to advertise a book that does not exist.</w:t>
       </w:r>
     </w:p>
     <w:p>
@@ -2876,12 +2876,12 @@
     </w:p>
     <w:p>
       <w:r>
-        <w:t>Before you spend, fill June’s three lines with your own.</w:t>
-      </w:r>
-    </w:p>
-    <w:p>
-      <w:r>
-        <w:t>Keep: about $2.58 on The Guest on Sunday, unless the broken step is the price itself.</w:t>
+        <w:t>Before you spend, here are the example author’s three lines. Write your own beside them.</w:t>
+      </w:r>
+    </w:p>
+    <w:p>
+      <w:r>
+        <w:t>Keep: about $2.58 on the example mystery, unless the broken step is the price itself.</w:t>
       </w:r>
     </w:p>
     <w:p>
@@ -3027,12 +3027,12 @@
     </w:p>
     <w:p>
       <w:r>
-        <w:t>Copy this shape. The lines under each label are yours to fill. The numbers above them are June’s month, a teaching example, not a report.</w:t>
-      </w:r>
-    </w:p>
-    <w:p>
-      <w:r>
-        <w:t>Book: The Guest on Sunday</w:t>
+        <w:t>Copy this shape. The lines under each label are yours to fill. The numbers above them are the example author’s month, a teaching example, not a report.</w:t>
+      </w:r>
+    </w:p>
+    <w:p>
+      <w:r>
+        <w:t>Book: the example cozy mystery</w:t>
       </w:r>
     </w:p>
     <w:p>
@@ -3207,7 +3207,7 @@
     </w:p>
     <w:p>
       <w:r>
-        <w:t>KDP asks about AI each time you publish a new book or republish an edited one. Answer for what you actually did. Amazon’s rule has two sides. If an AI tool wrote the text, made the cover or an interior picture, or did the translation, that is AI-generated, and you must say so even if you edited it heavily afterwards. If you wrote it and used a tool to check spelling, tighten sentences, or brainstorm ideas, that is AI-assisted, and you do not have to say so. Either way you are responsible for the content, including its rights. [8]</w:t>
+        <w:t>KDP asks about AI each time you publish a new book or republish an edited one. Answer for what you actually did. Text, a cover, an interior picture, or a translation that an AI tool produced must be declared, even after heavy editing. Spelling checks, tightening, and brainstorming on your own writing need not be. Either way you are responsible for the content. Chapter 32 states the rule in full. [8]</w:t>
       </w:r>
     </w:p>
     <w:p>
@@ -3438,7 +3438,7 @@
     </w:p>
     <w:p>
       <w:r>
-        <w:t>70% royalty, available when your list price falls within the plan’s price band for that marketplace (as of this writing, $2.99–$12.99 in the US store — expanded from a $9.99 ceiling that had stood since 2007, effective July 2026 — with corresponding bands in other currencies), minus a delivery fee based on the file’s size — historically about $0.15 per megabyte. This plan also carries a “don’t undercut yourself” rule: KDP can decline the 70% rate if you’re offering the same book for less somewhere else. The expansion is opt-in for existing titles: a book already priced between $10 and $12.99 stays on the 35% plan until you go into Rights &amp; Pricing and switch it by hand — the wider band doesn’t apply itself.</w:t>
+        <w:t>70% royalty, available when your list price falls within the plan’s price band for that marketplace (as of this writing, $2.99–$12.99 in the US store — expanded from a $9.99 ceiling that had stood since 2007, effective July 2026 — with corresponding bands in other currencies), after a delivery fee based on the file’s size — about $0.15 per megabyte in the US store — is taken off the list price. The 70% applies to what is left: 0.70 × (list price − any VAT − delivery), the same formula Chapter 3 uses. This plan also carries a “don’t undercut yourself” rule: KDP can decline the 70% rate if you’re offering the same book for less somewhere else. The expansion is opt-in for existing titles: a book already priced between $10 and $12.99 stays on the 35% plan until you go into Rights &amp; Pricing and switch it by hand — the wider band doesn’t apply itself.</w:t>
       </w:r>
     </w:p>
     <w:p>
@@ -3457,7 +3457,7 @@
     </w:p>
     <w:p>
       <w:r>
-        <w:t>35% royalty, available at any price from $0.99 up to $200, with no delivery fee subtracted. This is the only plan available outside the 70% price band — price a book at $1.99 or $12.99 and you’re on 35% automatically, whether you meant to be or not.</w:t>
+        <w:t>35% royalty, available at any price from $0.99 up to $200, with no delivery fee subtracted. This is the only plan available outside the 70% price band — price a book at $1.99 or $13.99 and you’re on 35% automatically, whether you meant to be or not.</w:t>
       </w:r>
     </w:p>
     <w:p>
@@ -3470,12 +3470,12 @@
         <w:ind w:left="504" w:right="288"/>
       </w:pPr>
       <w:r>
-        <w:t>Worked example. A 350-page ebook, roughly 1.2 MB as an EPUB, priced at $4.99:</w:t>
-      </w:r>
-    </w:p>
-    <w:p>
-      <w:r>
-        <w:t>At 70%: $4.99 × 0.70 = $3.493, minus a delivery fee of roughly 1.2 MB × $0.15 ≈ $0.18. Net royalty ≈ $3.31 per copy.</w:t>
+        <w:t>Worked example. A 350-page ebook, about 2 MB as Amazon converts it, priced at $4.99, no VAT:</w:t>
+      </w:r>
+    </w:p>
+    <w:p>
+      <w:r>
+        <w:t>At 70%: delivery is 2 MB × $0.15 = $0.30, taken off first, so 0.70 × ($4.99 − $0.30) ≈ $3.28 per copy, the same keep as the $4.99 line in Chapter 3.</w:t>
       </w:r>
     </w:p>
     <w:p>
@@ -3488,7 +3488,7 @@
         <w:ind w:left="504" w:right="288"/>
       </w:pPr>
       <w:r>
-        <w:t>Pricing $2.50 lower cost this author roughly $2.44 per sale, not $0.87. That gap is the whole reason Chapter 23 spends as much time on pricing psychology as it does — the 70% band isn’t a suggestion, it’s where almost every nonfiction ebook in this genre should live unless there’s a specific reason not to.</w:t>
+        <w:t>Pricing $2.50 lower cost this author roughly $2.41 per sale, not $0.87. That gap is the whole reason Chapter 23 spends as much time on pricing psychology as it does — the 70% band isn’t a suggestion, it’s where almost every nonfiction ebook in this genre should live unless there’s a specific reason not to.</w:t>
       </w:r>
     </w:p>
     <w:p>
@@ -3498,7 +3498,7 @@
       <w:r>
         <w:drawing>
           <wp:inline xmlns:a="http://schemas.openxmlformats.org/drawingml/2006/main" xmlns:pic="http://schemas.openxmlformats.org/drawingml/2006/picture">
-            <wp:extent cx="4023360" cy="2880925"/>
+            <wp:extent cx="4023360" cy="2880003"/>
             <wp:docPr id="6" name="Picture 6" descr="fig02"/>
             <wp:cNvGraphicFramePr>
               <a:graphicFrameLocks noChangeAspect="1"/>
@@ -3519,7 +3519,7 @@
                   <pic:spPr>
                     <a:xfrm>
                       <a:off x="0" y="0"/>
-                      <a:ext cx="4023360" cy="2880925"/>
+                      <a:ext cx="4023360" cy="2880003"/>
                     </a:xfrm>
                     <a:prstGeom prst="rect"/>
                   </pic:spPr>
@@ -3561,7 +3561,7 @@
     </w:p>
     <w:p>
       <w:r>
-        <w:t>For a sense of scale with a real book instead of a round number: this book runs about 34,000 words. Amazon doesn’t publish its exact KENPC formula, but the figure self-publishers have reverse-engineered by comparing known word counts against observed KENPC values clusters around 250 words per normalized page — which would put this book at roughly 135 KENPC pages, and one full Kindle Unlimited read of it at around $0.60 at the rate used above. Treat that as an estimate, not a receipt; the point is that a word count and a KU payout are the same number wearing different clothes.</w:t>
+        <w:t>For a sense of scale with a real book instead of a round number: this book runs about 33,500 words. Amazon doesn’t publish its exact KENPC formula, but the figure self-publishers have reverse-engineered by comparing known word counts against observed KENPC values clusters around 250 words per normalized page — which would put this book at roughly 134 KENPC pages, and one full Kindle Unlimited read of it at around $0.60 at the rate used above. Treat that as an estimate, not a receipt; the point is that a word count and a KU payout are the same number wearing different clothes.</w:t>
       </w:r>
     </w:p>
     <w:p>
@@ -3584,7 +3584,7 @@
     </w:p>
     <w:p>
       <w:r>
-        <w:t>Paperback, sold through Amazon’s own store: 60% royalty rate.</w:t>
+        <w:t>Paperback, sold through Amazon’s own store: 60% royalty rate at a list price of $9.99 or more on Amazon.com, 50% below that (Chapter 3 works both cases; other marketplaces set their own dividing line).</w:t>
       </w:r>
     </w:p>
     <w:p>
@@ -3623,7 +3623,7 @@
     </w:p>
     <w:p>
       <w:r>
-        <w:t>Everything above is policy, which changes; your KDP Reports dashboard is fact, which doesn’t. Once a book is live, check the Sales Dashboard for units and estimated royalties in near-real time, and the Prior Months’ Royalties report once a month closes for the exact, finalized figures (including that month’s KENP rate). Get in the habit of reading it weekly during a launch and monthly afterward — it’s the only source in this entire book that’s about your book specifically rather than the platform in general, and every other chapter’s advice should eventually show up as a change in these numbers.</w:t>
+        <w:t>Everything above is policy, which changes; your KDP Reports dashboard is fact, which doesn’t. Chapter 26 explains which of its reports to trust for what. Get in the habit of reading them weekly during a launch and monthly afterward — they are the only source in this entire book that’s about your book specifically rather than the platform in general, and every other chapter’s advice should eventually show up as a change in these numbers.</w:t>
       </w:r>
     </w:p>
     <w:p>
@@ -3859,7 +3859,7 @@
         <w:ind w:left="504" w:right="288"/>
       </w:pPr>
       <w:r>
-        <w:t>Case study: what “professional-grade” editing actually looks like in practice. One real example: a long technical nonfiction manuscript went through three separate independent review passes after its first “complete” draft — each one specifically briefed to hunt for what the previous pass missed rather than re-check settled items, each one independently re-deriving every worked numerical example from scratch rather than trusting the displayed answer. The three passes together found and fixed 13, then 21, then 18 confirmed issues — genuine arithmetic errors, a claim that quietly contradicted the book’s own stated formula two paragraphs earlier, cross-references pointing at the wrong chapter after a renumbering, and (twice) a fix from an earlier pass that had itself introduced a new, smaller inconsistency. A separate manuscript was put through a dedicated mechanical sweep for overused qualifier words — “roughly,” “essentially,” “itself” — appearing twice on the same page, catching 111 instances a normal read-through had sailed past every time, because a reader’s eye and a targeted script are looking for different things. The lesson isn’t “hire three editors” if your budget doesn’t allow it — it’s that the errors still in your manuscript after one careful read are, almost by definition, the ones a normal read doesn’t catch. Budget at least one pass that is specifically not just reading the book again: a fact-check pass, a consistency script, a reader who has never seen the manuscript before.</w:t>
+        <w:t>Illustration: what “professional-grade” editing looks like in practice. Picture a long technical handbook put through three separate review passes after its first “complete” draft — each one briefed to hunt for what the previous pass missed rather than re-check settled items, and each one re-deriving every worked numerical example from scratch rather than trusting the displayed answer. A process like that keeps finding a fresh batch of real problems on every pass: arithmetic errors, a claim that quietly contradicts the book’s own formula two paragraphs earlier, cross-references pointing at the wrong chapter after a renumbering, and sometimes a fix from an earlier pass that introduced a new, smaller inconsistency of its own. A mechanical sweep is a different tool again: a simple search for overused qualifier words — “roughly,” “essentially,” “itself” — appearing twice on the same page can turn up dozens of repeats in a cookbook or a memoir that a normal read-through sails past every time, because a reader’s eye and a targeted script are looking for different things. The lesson isn’t “hire three editors” if your budget doesn’t allow it — it’s that the errors still in your manuscript after one careful read are, almost by definition, the ones a normal read doesn’t catch. Budget at least one pass that is specifically not just reading the book again: a fact-check pass, a consistency script, a reader who has never seen the manuscript before.</w:t>
       </w:r>
     </w:p>
     <w:p>
@@ -4633,7 +4633,7 @@
     </w:p>
     <w:p>
       <w:r>
-        <w:t>KDP Select enrollment (Chapter 27) unlocks Free Book Promotions — a limited number of days where an enrolled book can be offered free directly on Amazon, useful for a launch push or to re-energize a backlist title’s visibility. The alternative in each 90-day term is a Kindle Countdown Deal: a discount of up to seven days, on Amazon.com and Amazon.co.uk only, once the book has been enrolled for at least 30 days, and you keep your selected royalty rate during the deal, even below $2.99. You get one or the other per term, never both. These tools have changed before, so check the KDP Select pages for what is offered today rather than relying on an older blog post.</w:t>
+        <w:t>KDP Select enrollment (Chapter 27) unlocks Free Book Promotions — a limited number of days where an enrolled book can be offered free directly on Amazon, useful for a launch push or to re-energize a backlist title’s visibility. The alternative in each 90-day term is a Kindle Countdown Deal, a short scheduled discount that keeps your selected royalty rate even below $2.99; idea 9 in Chapter 8 lists its eligibility and list-price rules. You get one or the other per term, never both. These tools have changed before, so check the KDP Select pages for what is offered today rather than relying on an older blog post.</w:t>
       </w:r>
     </w:p>
     <w:p>
@@ -4880,7 +4880,12 @@
         <w:ind w:left="504" w:right="288"/>
       </w:pPr>
       <w:r>
-        <w:t>Worked example. A $4.99 ebook earning a $3.31 net royalty (Chapter 17’s worked example) has a break-even ACOS of 3.31 ÷ 4.99 ≈ 66%. Spend $10 in ads and sell three copies attributed to that spend (royalty: $9.93) and your actual ACOS is 10 ÷ 9.93 ≈ 101% — losing money on the ad, even though it “worked” in the sense of generating sales. The same $10 spend producing five sales (royalty: $16.55) gives an ACOS of 10 ÷ 16.55 ≈ 60% — under the 66% break-even line, and genuinely profitable.</w:t>
+        <w:t>Worked example. A $4.99 ebook earning a $3.28 royalty (Chapter 17’s worked example, the same keep as Chapter 3) has a break-even ACOS of 3.28 ÷ 4.99 ≈ 66%. Spend $10 in ads and sell two copies attributed to that spend ($9.98 in sales, $6.56 in royalty) and your ACOS is 10 ÷ 9.98 ≈ 100% — about $3.44 lost on the ad, even though it “worked” in the sense of generating sales. The same $10 spend producing five sales ($24.95 in sales, $16.40 in royalty) gives an ACOS of 10 ÷ 24.95 ≈ 40% — under the 66% break-even line, and about $6.40 ahead.</w:t>
+      </w:r>
+    </w:p>
+    <w:p>
+      <w:r>
+        <w:t>Chapter 9 runs the same test from the other end, as the most a single click can cost before it eats the keep. Use whichever form your ad screen makes easier to read; they give the same answer.</w:t>
       </w:r>
     </w:p>
     <w:p>
@@ -4895,7 +4900,7 @@
       <w:r>
         <w:drawing>
           <wp:inline xmlns:a="http://schemas.openxmlformats.org/drawingml/2006/main" xmlns:pic="http://schemas.openxmlformats.org/drawingml/2006/picture">
-            <wp:extent cx="4023360" cy="2736220"/>
+            <wp:extent cx="4023360" cy="2734628"/>
             <wp:docPr id="15" name="Picture 15" descr="fig11"/>
             <wp:cNvGraphicFramePr>
               <a:graphicFrameLocks noChangeAspect="1"/>
@@ -4916,7 +4921,7 @@
                   <pic:spPr>
                     <a:xfrm>
                       <a:off x="0" y="0"/>
-                      <a:ext cx="4023360" cy="2736220"/>
+                      <a:ext cx="4023360" cy="2734628"/>
                     </a:xfrm>
                     <a:prstGeom prst="rect"/>
                   </pic:spPr>
@@ -5222,18 +5227,18 @@
         <w:ind w:left="504" w:right="288"/>
       </w:pPr>
       <w:r>
-        <w:t>Worked example. A 300-KENPC-page nonfiction ebook at $4.99 (net 70% royalty ≈ $3.31/copy after the delivery fee, per Chapter 17), against 300 reader engagements over one 90-day term:</w:t>
-      </w:r>
-    </w:p>
-    <w:p>
-      <w:r>
-        <w:t xml:space="preserve">All 300 as direct purchases, wide distribution, comparable net across stores: 300 × $3.31 ≈ </w:t>
+        <w:t>Worked example. A 300-KENPC-page nonfiction ebook at $4.99 (70% royalty ≈ $3.28/copy after the delivery fee, per Chapter 17), against 300 reader engagements over one 90-day term:</w:t>
+      </w:r>
+    </w:p>
+    <w:p>
+      <w:r>
+        <w:t xml:space="preserve">All 300 as direct purchases, wide distribution, comparable net across stores: 300 × $3.28 ≈ </w:t>
       </w:r>
       <w:r>
         <w:rPr>
           <w:b/>
         </w:rPr>
-        <w:t>$993</w:t>
+        <w:t>$984</w:t>
       </w:r>
       <w:r>
         <w:t xml:space="preserve"> for the term.</w:t>
@@ -5241,13 +5246,13 @@
     </w:p>
     <w:p>
       <w:r>
-        <w:t xml:space="preserve">The same 300 readers under Select, but 120 of them read the book in full through Kindle Unlimited instead of buying it (at Chapter 17’s illustrative $0.0045/page rate): 180 direct sales (180 × $3.31 ≈ $595.80) plus 120 full KU reads (120 × 300 pages × $0.0045 ≈ $162) ≈ </w:t>
+        <w:t xml:space="preserve">The same 300 readers under Select, but 120 of them read the book in full through Kindle Unlimited instead of buying it (at Chapter 17’s illustrative $0.0045/page rate): 180 direct sales (180 × $3.28 ≈ $590.40) plus 120 full KU reads (120 × 300 pages × $0.0045 ≈ $162) ≈ </w:t>
       </w:r>
       <w:r>
         <w:rPr>
           <w:b/>
         </w:rPr>
-        <w:t>$757.80</w:t>
+        <w:t>$752.40</w:t>
       </w:r>
       <w:r>
         <w:t>.</w:t>
@@ -5255,7 +5260,7 @@
     </w:p>
     <w:p>
       <w:r>
-        <w:t>In this illustration, wide comes out ahead per reader, because a full KU read at $1.35 is worth less than a $3.31 sale. Select only wins the comparison when it brings in readers who would not have bought at $4.99 at all — a number this book cannot supply for your specific book, your genre, or your audience. That missing number is exactly why the advice above is to run one real term and read your own dashboard, not to trust this arithmetic, or anyone else’s, for a decision this dependent on who your actual readers are.</w:t>
+        <w:t>In this illustration, wide comes out ahead per reader, because a full KU read at $1.35 is worth less than a $3.28 sale. Select only wins the comparison when it brings in readers who would not have bought at $4.99 at all — a number this book cannot supply for your specific book, your genre, or your audience. That missing number is exactly why the advice above is to run one real term and read your own dashboard, not to trust this arithmetic, or anyone else’s, for a decision this dependent on who your actual readers are.</w:t>
       </w:r>
     </w:p>
     <w:p>
@@ -5500,7 +5505,7 @@
         <w:ind w:left="504" w:right="288"/>
       </w:pPr>
       <w:r>
-        <w:t>Case study: planning for compounding from day one. One real example: a technical nonfiction series was planned from the start as many separate, topic-sized books rather than as a single giant volume — explicitly so that each finished book would immediately extend the discoverability and “more by this author” surface of every other book already published, instead of asking one enormous, slow-to-finish book to carry the entire catalog’s earning potential alone. A broader catalog built the same way often spans several genuinely different categories at once, which spreads risk the same way a diversified small-business portfolio does: a slow month or an algorithm change affecting one category doesn’t take down income from the others at the same time. Neither choice — many small books in one series, or several unrelated catalogs at once — is the “correct” one in isolation; both are the same underlying principle (a catalog compounds; a single book doesn’t) applied to two different situations.</w:t>
+        <w:t>Illustration: planning for compounding from day one. Picture a beginner’s guide to a hobby planned from the start as a set of separate, topic-sized books — getting started, the common mistakes, the first big project — rather than as a single giant volume, so that each finished book immediately extends the discoverability and “more by this author” surface of every book already published, instead of asking one enormous, slow-to-finish book to carry the entire catalog’s earning potential alone. Another author might run two unrelated lines at once, say a cozy mystery series and a set of regional cookbooks, which spreads risk the same way a diversified small-business portfolio does: a slow month or an algorithm change affecting one category doesn’t take down income from the other at the same time. Neither choice — many small books in one series, or several unrelated catalogs at once — is the “correct” one in isolation; both are the same underlying principle (a catalog compounds; a single book doesn’t) applied to two different situations.</w:t>
       </w:r>
     </w:p>
     <w:p>
@@ -5791,7 +5796,7 @@
     </w:p>
     <w:p>
       <w:r>
-        <w:t>A note on the examples ahead: the public field reports this chapter can actually check — named authors, real numbers, a real launch date — mostly come from fiction, because fiction authors publish that kind of detail far more often than nonfiction authors do. The mechanics don’t care: a review-eligibility rule, a royalty band, and a launch-week concentration effect work identically on a novel and a how-to guide. Read “book one” and “series” below as your nonfiction title and your line of related titles (Chapter 29) — the arithmetic transfers directly, even where the example doesn’t.</w:t>
+        <w:t>A note on the examples ahead: the public field reports this chapter can actually check — published accounts, real numbers, a real launch date — mostly come from fiction, because fiction authors publish that kind of detail far more often than nonfiction authors do. The mechanics don’t care: a review-eligibility rule, a royalty band, and a launch-week concentration effect work identically on a novel and a how-to guide. Read “book one” and “series” below as your nonfiction title and your line of related titles (Chapter 29) — the arithmetic transfers directly, even where the example doesn’t.</w:t>
       </w:r>
     </w:p>
     <w:p>
@@ -5945,7 +5950,7 @@
     </w:p>
     <w:p>
       <w:r>
-        <w:t>On Amazon.com, the 70 percent ebook option applies whenever your list price sits inside the published band — $2.99 to $12.99 after the July 2026 expansion — and you’ve actually selected that option at upload. Outside that band, you earn 35 percent instead. A delivery cost, on the order of $0.15 per megabyte of the file, is deducted under the 70 percent plan and not under the 35 percent one. For a lean text file, 70 percent is unambiguously the better choice anywhere inside the band; a heavily illustrated file can eat into that advantage, so check your actual file size before assuming the percentage tells the whole story.</w:t>
+        <w:t>Chapters 3 and 17 set out the two ebook options: 70 percent inside the $2.99–$12.99 band on Amazon.com, once you select it, with the delivery charge taken off the price first, and 35 percent outside the band with no delivery charge. This section applies that rule to launch and series pricing rather than restating it.</w:t>
       </w:r>
     </w:p>
     <w:p>
@@ -5959,7 +5964,7 @@
         <w:t>Worked example.</w:t>
       </w:r>
       <w:r>
-        <w:t xml:space="preserve"> A price-by-price picture, approximate, 2 MB file, 70 percent selected — delivery fee (~$0.15/MB × 2MB = $0.30) subtracted wherever 70 percent applies, per the rule above:</w:t>
+        <w:t xml:space="preserve"> A price-by-price picture, approximate, 2 MB file, no VAT, 70 percent selected — 0.70 × (price − $0.30 delivery) wherever 70 percent applies, the same keeps as Chapter 3:</w:t>
       </w:r>
     </w:p>
     <w:tbl>
@@ -6097,7 +6102,7 @@
           </w:tcPr>
           <w:p>
             <w:r>
-              <w:t>~$1.79</w:t>
+              <w:t>~$1.88</w:t>
             </w:r>
           </w:p>
         </w:tc>
@@ -6139,7 +6144,7 @@
           </w:tcPr>
           <w:p>
             <w:r>
-              <w:t>~$2.49–$3.19</w:t>
+              <w:t>~$2.58–$3.28</w:t>
             </w:r>
           </w:p>
         </w:tc>
@@ -6181,7 +6186,7 @@
           </w:tcPr>
           <w:p>
             <w:r>
-              <w:t>~$3.89–$5.29</w:t>
+              <w:t>~$3.98–$5.38</w:t>
             </w:r>
           </w:p>
         </w:tc>
@@ -6223,7 +6228,7 @@
           </w:tcPr>
           <w:p>
             <w:r>
-              <w:t>~$6.69–$8.79</w:t>
+              <w:t>~$6.78–$8.88</w:t>
             </w:r>
           </w:p>
         </w:tc>
@@ -6331,16 +6336,16 @@
     </w:p>
     <w:p>
       <w:r>
-        <w:t xml:space="preserve">Here’s the same math worked through for a heavier file: a 20 MB illustrated nonfiction title priced at $9.99 with the 70 percent option selected. Royalty: $9.99 × 0.70 = $6.99. Delivery fee: $0.15/MB × 20 MB = $3.00. Net: roughly </w:t>
+        <w:t xml:space="preserve">Here’s the same math worked through for a heavier file: a 20 MB illustrated nonfiction title priced at $9.99 with the 70 percent option selected. Delivery fee: $0.15/MB × 20 MB = $3.00, taken off first. Royalty: 0.70 × ($9.99 − $3.00) ≈ </w:t>
       </w:r>
       <w:r>
         <w:rPr>
           <w:b/>
         </w:rPr>
-        <w:t>$4.00</w:t>
-      </w:r>
-      <w:r>
-        <w:t xml:space="preserve"> — well below the $6.69–$8.79 the table above shows for a lean 2 MB file at a similar price. The royalty percentage never changed; the file size did all the damage. Compress your images before trusting any of these figures for your own book, and rerun the math on </w:t>
+        <w:t>$4.89</w:t>
+      </w:r>
+      <w:r>
+        <w:t xml:space="preserve"> — well below the $6.78–$8.88 the table above shows for a lean 2 MB file at a similar price. The royalty percentage never changed; the file size did all the damage. Compress your images before trusting any of these figures for your own book, and rerun the math on </w:t>
       </w:r>
       <w:hyperlink r:id="rId29">
         <w:r>
@@ -6357,7 +6362,7 @@
     </w:p>
     <w:p>
       <w:r>
-        <w:t>Print is an entirely separate ledger from the ebook math above. Paperback royalties are calculated as list price minus print cost, times the print royalty rate — and Amazon has tightened that rate in recent years on lower-priced paperbacks specifically. Don’t let a paperback’s list price influence your ebook price out of vanity, and don’t set a paperback’s price so low that the print cost simply eats the royalty; the print cost doesn’t care how proud you are of the cover.</w:t>
+        <w:t>Print is an entirely separate ledger from the ebook math above: the print rate times the list price, minus the print cost (Chapters 3 and 17), with the rate on Amazon.com dropping from 60 to 50 percent below a $9.99 list price. Don’t let a paperback’s list price influence your ebook price out of vanity, and don’t set a paperback’s price so low that the print cost simply eats the royalty; the print cost doesn’t care how proud you are of the cover.</w:t>
       </w:r>
     </w:p>
     <w:p>
@@ -6826,7 +6831,7 @@
     </w:p>
     <w:p>
       <w:r>
-        <w:t>Amazon’s own help text is fairly direct on this: you may give away a free or discounted copy, but you may not require a review in exchange, steer what it says, or add any other gift. Friends, employees, and author-for-author review swaps all sit outside what Amazon considers acceptable here. An unverified advance-copy review still displays publicly — it simply lacks the Verified Purchase badge. Chasing that badge by refunding readers after they buy is exactly the kind of pattern that gets listings cleaned out.</w:t>
+        <w:t>Chapter 6 gave the rule in one line: a free or discounted copy is allowed, but a required, steered, or rewarded review is not. Friends, employees, and author-for-author review swaps all sit outside what Amazon considers acceptable here. An unverified advance-copy review still displays publicly — it simply lacks the Verified Purchase badge. Chasing that badge by refunding readers after they buy is exactly the kind of pattern that gets listings cleaned out.</w:t>
       </w:r>
     </w:p>
     <w:p>
@@ -7410,7 +7415,7 @@
     </w:p>
     <w:p>
       <w:r>
-        <w:t>Recall that Select is a ninety-day exclusivity commitment that pays out Kindle Unlimited page reads and offers either five free promotional days or a Kindle Countdown Deal. Free days used after you have proof the book converts, and actually announced to someone, can genuinely acquire new readers. Free days used before you have that proof, announced to no one, are a tree falling in an empty forest. A Countdown Deal keeps your list price and 70 percent royalty intact as long as you stay inside the band — it’s built for books that are already selling, not for books trying to find their first readers.</w:t>
+        <w:t>Select’s terms are in Chapter 27: ninety days of ebook exclusivity, page-read income, and either free promotional days or a Kindle Countdown Deal in each term. Free days used after you have proof the book converts, and actually announced to someone, can genuinely acquire new readers. Free days used before you have that proof, announced to no one, are a tree falling in an empty forest. A Countdown Deal keeps your 70 percent royalty during the discount, even below $2.99 — it’s built for books that are already selling, not for books trying to find their first readers.</w:t>
       </w:r>
     </w:p>
     <w:p>
@@ -7548,36 +7553,20 @@
       </w:r>
     </w:p>
     <w:p>
-      <w:pPr>
-        <w:pStyle w:val="Heading5"/>
-      </w:pPr>
-      <w:r>
-        <w:t>Letters</w:t>
-      </w:r>
-    </w:p>
-    <w:p>
-      <w:pPr>
-        <w:ind w:left="504" w:right="288"/>
-      </w:pPr>
-      <w:r>
-        <w:t>You are confirmed for an advance copy of [Title]. File on [date]. Live [date]. An honest review after publication would help the book find strangers. It is not required. No rating is requested. If the date fails, reply and you are removed.</w:t>
-      </w:r>
-    </w:p>
-    <w:p>
-      <w:pPr>
-        <w:ind w:left="504" w:right="288"/>
-      </w:pPr>
-      <w:r>
-        <w:t>The file is ready. I will send the Amazon address on publication morning. Write what you think, or write nothing.</w:t>
-      </w:r>
-    </w:p>
-    <w:p>
-      <w:pPr>
-        <w:ind w:left="504" w:right="288"/>
-      </w:pPr>
-      <w:r>
-        <w:t>The book is live. Optional honest review: https://www.amazon.com/review/create-review?asin=YOURASIN</w:t>
-      </w:r>
+      <w:r>
+        <w:t>The letters for each step — invitation, confirmation, delivery, live page, and the one follow-up — are in Chapter 13, ready to copy. The live-page letter can link straight to Amazon’s review form, with your own ASIN in place of the placeholder:</w:t>
+      </w:r>
+    </w:p>
+    <w:p>
+      <w:hyperlink r:id="rId37">
+        <w:r>
+          <w:rPr>
+            <w:color w:val="0C2D5A"/>
+            <w:u w:val="single"/>
+          </w:rPr>
+          <w:t xml:space="preserve">https://www.amazon.com/review/create-review?asin=YOURASIN</w:t>
+        </w:r>
+      </w:hyperlink>
     </w:p>
     <w:p>
       <w:pPr>
@@ -7614,26 +7603,17 @@
         <w:pStyle w:val="Heading5"/>
       </w:pPr>
       <w:r>
-        <w:t xml:space="preserve">Daniel Arenson, </w:t>
-      </w:r>
-      <w:r>
-        <w:rPr>
-          <w:i/>
-        </w:rPr>
-        <w:t>Earth Alone</w:t>
-      </w:r>
-      <w:r>
-        <w:t xml:space="preserve"> (BookBub Partners, 2016)</w:t>
-      </w:r>
-    </w:p>
-    <w:p>
-      <w:r>
-        <w:t>Arenson was not a first-time author, and that fact is part of the lesson here. Two weeks before launch, he sent digital advance copies to forty readers through BookFunnel, and about half of them posted a review on launch day. He also placed short quotes in the editorial-review field on the product page, which is a separate thing from the customer-review module itself. He launched at $0.99 and raised the price to $2.99 within a week. Over the first seven weeks, the book sold more than 20,000 copies plus a substantial amount of Kindle Unlimited reading, and Arenson has said explicitly that his mailing list did more for the launch than any single other tactic.</w:t>
-      </w:r>
-    </w:p>
-    <w:p>
-      <w:r>
-        <w:t>What’s worth copying here: the two-week advance-copy window, using BookFunnel as delivery plumbing, and a planned price raise after launch. What’s not worth copying blindly: opening at $0.99 with no list and no sequel of your own — Arenson was effectively buying rank with a crowd he already owned.</w:t>
+        <w:t>An established science-fiction author’s series launch (BookBub Partners case study, 2016)</w:t>
+      </w:r>
+    </w:p>
+    <w:p>
+      <w:r>
+        <w:t>The author was not a first-timer, and that fact is part of the lesson here. Two weeks before launch, he sent digital advance copies to forty readers through BookFunnel, and about half of them posted a review on launch day. He also placed short quotes in the editorial-review field on the product page, which is a separate thing from the customer-review module itself. He launched at $0.99 and raised the price to $2.99 within a week. Over the first seven weeks, the book sold more than 20,000 copies plus a substantial amount of Kindle Unlimited reading, and the author has said explicitly that his mailing list did more for the launch than any single other tactic.</w:t>
+      </w:r>
+    </w:p>
+    <w:p>
+      <w:r>
+        <w:t>What’s worth copying here: the two-week advance-copy window, using BookFunnel as delivery plumbing, and a planned price raise after launch. What’s not worth copying blindly: opening at $0.99 with no list and no sequel of your own — this author was effectively buying rank with a crowd he already owned.</w:t>
       </w:r>
     </w:p>
     <w:p>
@@ -7641,21 +7621,12 @@
         <w:pStyle w:val="Heading5"/>
       </w:pPr>
       <w:r>
-        <w:t xml:space="preserve">Cindy L. Sell, </w:t>
-      </w:r>
-      <w:r>
-        <w:rPr>
-          <w:i/>
-        </w:rPr>
-        <w:t>Remnants</w:t>
-      </w:r>
-      <w:r>
-        <w:t xml:space="preserve"> (BookBub Partners interview, 2024)</w:t>
-      </w:r>
-    </w:p>
-    <w:p>
-      <w:r>
-        <w:t>This is a debut closer to what most first-time authors actually face. Sell built her advance-reader roster using a Google Form, social media posts, BookFunnel delivery, and BookSirens — the latter producing nine readers and seven reviews, some of them usefully detailed. Goodreads filled up first, reaching around 120 ratings before Amazon’s review count caught up. She priced the ebook at $3.99 and didn’t discount it immediately, and a week after launch reported more than 200 copies sold. The features that actually moved units were a BookBub New Releases for Less placement and an advance-access email blast — not the ARC team on its own.</w:t>
+        <w:t>A debut novelist’s launch (BookBub Partners interview, 2024)</w:t>
+      </w:r>
+    </w:p>
+    <w:p>
+      <w:r>
+        <w:t>This is a debut closer to what most first-time authors actually face. The author built her advance-reader roster using a Google Form, social media posts, BookFunnel delivery, and BookSirens — the latter producing nine readers and seven reviews, some of them usefully detailed. Goodreads filled up first, reaching around 120 ratings before Amazon’s review count caught up. She priced the ebook at $3.99 and didn’t discount it immediately, and a week after launch reported more than 200 copies sold. The features that actually moved units were a BookBub New Releases for Less placement and an advance-access email blast — not the ARC team on its own.</w:t>
       </w:r>
     </w:p>
     <w:p>
@@ -7668,19 +7639,19 @@
         <w:pStyle w:val="Heading5"/>
       </w:pPr>
       <w:r>
-        <w:t>Michael Anderle and the 20Booksto50K philosophy (multiple interviews, 2017–2024)</w:t>
-      </w:r>
-    </w:p>
-    <w:p>
-      <w:r>
-        <w:t>This one isn’t a single launch, and isn’t quite this chapter’s usual kind of case study — it’s a publishing philosophy, documented on the record across many interviews rather than as one countable event. Anderle, through LMBPN Publishing, built a catalog of several hundred titles around a stated unit target: roughly $7.50 in royalty per book per day as the bar a title needs to clear to remain worth active promotion, a figure he has repeated consistently across interviews rather than asserted just once. The name “20Booksto50K” describes the broader movement that his and Judith Anderle’s talks helped start — prioritizing volume and catalog depth over any single book’s individual performance, with book one deliberately priced to move readers into the later books that actually carry the margin.</w:t>
+        <w:t>The 20Booksto50K philosophy (an indie publisher, multiple interviews, 2017–2024)</w:t>
+      </w:r>
+    </w:p>
+    <w:p>
+      <w:r>
+        <w:t>This one isn’t a single launch, and isn’t quite this chapter’s usual kind of case study — it’s a publishing philosophy, documented on the record across many interviews rather than as one countable event. The publisher behind it, through LMBPN Publishing, built a catalog of several hundred titles around a stated unit target: roughly $7.50 in royalty per book per day as the bar a title needs to clear to remain worth active promotion, a figure he has repeated consistently across interviews rather than asserted just once. The name “20Booksto50K” describes the broader movement that the press’s founders helped start through their talks — prioritizing volume and catalog depth over any single book’s individual performance, with book one deliberately priced to move readers into the later books that actually carry the margin.</w:t>
       </w:r>
     </w:p>
     <w:p>
       <w:r>
         <w:t xml:space="preserve">What’s worth copying: setting a stated per-unit bar instead of relying on a vague sense that a book is “selling okay,” and deliberately treating book one as an acquisition cost at full catalog scale. What’s not worth copying blindly: this model assumes a catalog large enough that the bar can be measured across dozens of titles at once — </w:t>
       </w:r>
-      <w:hyperlink r:id="rId37">
+      <w:hyperlink r:id="rId38">
         <w:r>
           <w:rPr>
             <w:color w:val="0C2D5A"/>
@@ -7703,7 +7674,7 @@
     </w:p>
     <w:p>
       <w:r>
-        <w:t>Unlike the two named cases above, this one doesn’t actually clear this book’s own bar for a real case study — it comes secondhand, from a formatter describing unnamed KDP exports rather than from a named author on the record. It’s included only because the shape it describes recurs often enough to be worth naming, clearly marked here as the exception it is. In this account, a four-book series sat at a flat $4.99 for six months, with book-one-to-book-two read-through running at about 11 percent. Book one was then cut to $0.99 for thirty days with the rest of the series already live, and read-through to book two rose to about 19 percent during that window. Treat the shape of that result, not its specific numbers, as the real takeaway: don’t discount book one to nothing until a paid book two actually exists to receive the traffic.</w:t>
+        <w:t>Unlike the sourced cases above, this one doesn’t actually clear this book’s own bar for a real case study — it comes secondhand, from a formatter describing unnamed KDP exports rather than from a named author on the record. It’s included only because the shape it describes recurs often enough to be worth naming, clearly marked here as the exception it is. In this account, a four-book series sat at a flat $4.99 for six months, with book-one-to-book-two read-through running at about 11 percent. Book one was then cut to $0.99 for thirty days with the rest of the series already live, and read-through to book two rose to about 19 percent during that window. Treat the shape of that result, not its specific numbers, as the real takeaway: don’t discount book one to nothing until a paid book two actually exists to receive the traffic.</w:t>
       </w:r>
     </w:p>
     <w:p>
@@ -7737,7 +7708,7 @@
     </w:p>
     <w:p>
       <w:r>
-        <w:t>Arenson’s result above is, in part, a result of the list he’d already built. Some authors deliberately refuse to launch at all until a few hundred email addresses exist, on the reasoning that the first-review problem shrinks considerably once launch week is no longer cold. The real cost of this approach is time: if the manuscript is already finished, waiting a full year just to start the ARC clock is usually the wrong trade, since a finished manuscript ages more like milk than wine. The better approach is building the list in parallel with finishing the book, not before it.</w:t>
+        <w:t>The established author’s result above is, in part, a result of the list he’d already built. Some authors deliberately refuse to launch at all until a few hundred email addresses exist, on the reasoning that the first-review problem shrinks considerably once launch week is no longer cold. The real cost of this approach is time: if the manuscript is already finished, waiting a full year just to start the ARC clock is usually the wrong trade, since a finished manuscript ages more like milk than wine. The better approach is building the list in parallel with finishing the book, not before it.</w:t>
       </w:r>
     </w:p>
     <w:p>
@@ -7750,7 +7721,7 @@
     </w:p>
     <w:p>
       <w:r>
-        <w:t>Sell’s decision to hold at $3.99 is this alternative in practice, as is the Kboards author who raised to $4.99 and ended up taking home more money on fewer copies. This approach fits a standalone book, a slower-writing author, or anyone who genuinely won’t have a sequel out this year.</w:t>
+        <w:t>The debut novelist’s decision to hold at $3.99 is this alternative in practice, as is the Kboards author who raised to $4.99 and ended up taking home more money on fewer copies. This approach fits a standalone book, a slower-writing author, or anyone who genuinely won’t have a sequel out this year.</w:t>
       </w:r>
     </w:p>
     <w:p>
@@ -8098,7 +8069,7 @@
       <w:r>
         <w:t xml:space="preserve"> content — where you wrote or created it yourself and a tool only edited, refined, error-checked, or helped you brainstorm — does not need to be disclosed. The distinction is Amazon’s to draw, not yours to interpret generously: get it wrong and the risk is the listing coming down, not a warning email. Disclosure happens privately at upload and never appears on the product page. See </w:t>
       </w:r>
-      <w:hyperlink r:id="rId38">
+      <w:hyperlink r:id="rId39">
         <w:r>
           <w:rPr>
             <w:color w:val="0C2D5A"/>
@@ -8192,7 +8163,7 @@
       <w:r>
         <w:t>Copyright protects the specific way an idea gets expressed — wording, chosen analogies, structure — not the underlying facts or ideas themselves (</w:t>
       </w:r>
-      <w:hyperlink r:id="rId39">
+      <w:hyperlink r:id="rId40">
         <w:r>
           <w:rPr>
             <w:color w:val="0C2D5A"/>
@@ -8250,7 +8221,7 @@
       <w:r>
         <w:t xml:space="preserve">“It’s transformative” — transformative purpose is one factor in a four-factor U.S. test, not a standalone pass (see the </w:t>
       </w:r>
-      <w:hyperlink r:id="rId40">
+      <w:hyperlink r:id="rId41">
         <w:r>
           <w:rPr>
             <w:color w:val="0C2D5A"/>
@@ -8299,7 +8270,7 @@
       <w:r>
         <w:t>If the goal is genuinely to build on someone else’s existing work rather than your own research, there are exactly two legitimate paths: get a license from the rights holder, or adapt something actually in the public domain — not just old, not just freely downloadable somewhere, but verified public domain in every territory you’ll sell in. Duration rules are jurisdiction-specific and don’t track intuition: a modern translation of a public-domain original can still be separately protected, and an “old” edition can carry its own separately-copyrighted introduction, annotations, or cover art (</w:t>
       </w:r>
-      <w:hyperlink r:id="rId41">
+      <w:hyperlink r:id="rId42">
         <w:r>
           <w:rPr>
             <w:color w:val="0C2D5A"/>
@@ -8575,7 +8546,7 @@
         <w:t xml:space="preserve">☐ </w:t>
       </w:r>
       <w:r>
-        <w:t>70% royalty band: list price $2.99–$12.99 (US), minus a delivery fee (~$0.15 per MB of file size) — the top of the band expanded from $9.99 in July 2026; existing titles priced $10–$12.99 must be switched to the new band by hand in Rights &amp; Pricing</w:t>
+        <w:t>70% royalty band: list price $2.99–$12.99 (US), with a delivery fee (~$0.15 per MB of file size) taken off the price before the 70% applies — the top of the band expanded from $9.99 in July 2026; existing titles priced $10–$12.99 must be switched to the new band by hand in Rights &amp; Pricing</w:t>
       </w:r>
     </w:p>
     <w:p>
@@ -8607,7 +8578,7 @@
         <w:t xml:space="preserve">☐ </w:t>
       </w:r>
       <w:r>
-        <w:t>Paperback (Amazon channel): 60% of list price, minus printing cost</w:t>
+        <w:t>Paperback (Amazon channel): 60% of list price at $9.99 and up on Amazon.com (50% below), minus printing cost</w:t>
       </w:r>
     </w:p>
     <w:p>
@@ -8683,7 +8654,7 @@
       <w:r>
         <w:t xml:space="preserve">The only reason to buy your own ISBN instead is control, not permission. A free KDP ISBN lists KDP as the book’s publisher of record and ties that specific ISBN to Amazon’s own print service. Buying your own — from </w:t>
       </w:r>
-      <w:hyperlink r:id="rId42">
+      <w:hyperlink r:id="rId43">
         <w:r>
           <w:rPr>
             <w:color w:val="0C2D5A"/>
@@ -8813,7 +8784,7 @@
       </w:r>
     </w:p>
     <w:p>
-      <w:hyperlink r:id="rId43">
+      <w:hyperlink r:id="rId44">
         <w:r>
           <w:rPr>
             <w:color w:val="0C2D5A"/>
@@ -8829,7 +8800,7 @@
       </w:r>
     </w:p>
     <w:p>
-      <w:hyperlink r:id="rId44">
+      <w:hyperlink r:id="rId45">
         <w:r>
           <w:rPr>
             <w:color w:val="0C2D5A"/>
@@ -8845,7 +8816,7 @@
       </w:r>
     </w:p>
     <w:p>
-      <w:hyperlink r:id="rId45">
+      <w:hyperlink r:id="rId46">
         <w:r>
           <w:rPr>
             <w:color w:val="0C2D5A"/>
@@ -8861,7 +8832,7 @@
       </w:r>
     </w:p>
     <w:p>
-      <w:hyperlink r:id="rId46">
+      <w:hyperlink r:id="rId47">
         <w:r>
           <w:rPr>
             <w:color w:val="0C2D5A"/>
@@ -8877,7 +8848,7 @@
       </w:r>
     </w:p>
     <w:p>
-      <w:hyperlink r:id="rId47">
+      <w:hyperlink r:id="rId48">
         <w:r>
           <w:rPr>
             <w:color w:val="0C2D5A"/>
@@ -8893,7 +8864,7 @@
       </w:r>
     </w:p>
     <w:p>
-      <w:hyperlink r:id="rId48">
+      <w:hyperlink r:id="rId49">
         <w:r>
           <w:rPr>
             <w:color w:val="0C2D5A"/>
@@ -8909,7 +8880,7 @@
       </w:r>
     </w:p>
     <w:p>
-      <w:hyperlink r:id="rId49">
+      <w:hyperlink r:id="rId50">
         <w:r>
           <w:rPr>
             <w:color w:val="0C2D5A"/>
@@ -8925,7 +8896,7 @@
       </w:r>
     </w:p>
     <w:p>
-      <w:hyperlink r:id="rId38">
+      <w:hyperlink r:id="rId39">
         <w:r>
           <w:rPr>
             <w:color w:val="0C2D5A"/>
@@ -8941,7 +8912,7 @@
       </w:r>
     </w:p>
     <w:p>
-      <w:hyperlink r:id="rId50">
+      <w:hyperlink r:id="rId51">
         <w:r>
           <w:rPr>
             <w:color w:val="0C2D5A"/>
@@ -8957,7 +8928,7 @@
       </w:r>
     </w:p>
     <w:p>
-      <w:hyperlink r:id="rId51">
+      <w:hyperlink r:id="rId52">
         <w:r>
           <w:rPr>
             <w:color w:val="0C2D5A"/>
@@ -8973,7 +8944,7 @@
       </w:r>
     </w:p>
     <w:p>
-      <w:hyperlink r:id="rId52">
+      <w:hyperlink r:id="rId53">
         <w:r>
           <w:rPr>
             <w:color w:val="0C2D5A"/>
@@ -8989,7 +8960,7 @@
       </w:r>
     </w:p>
     <w:p>
-      <w:hyperlink r:id="rId53">
+      <w:hyperlink r:id="rId54">
         <w:r>
           <w:rPr>
             <w:color w:val="0C2D5A"/>

</xml_diff>

<commit_message>
Your First Book That Sells: coherence pass - bridge into the full guide, closing word before appendices tied to the keep test, updated word count; rebuild master
</commit_message>
<xml_diff>
--- a/Your First Book That Sells/Your First Book That Sells.docx
+++ b/Your First Book That Sells/Your First Book That Sells.docx
@@ -681,6 +681,20 @@
       <w:pPr>
         <w:spacing w:after="40"/>
       </w:pPr>
+      <w:hyperlink w:anchor="h_a_closing_word">
+        <w:r>
+          <w:rPr>
+            <w:color w:val="0C2D5A"/>
+            <w:u w:val="single"/>
+          </w:rPr>
+          <w:t xml:space="preserve">A Closing Word</w:t>
+        </w:r>
+      </w:hyperlink>
+    </w:p>
+    <w:p>
+      <w:pPr>
+        <w:spacing w:after="40"/>
+      </w:pPr>
       <w:hyperlink w:anchor="h_appendix_a_the_one_page_launch_check">
         <w:r>
           <w:rPr>
@@ -748,20 +762,6 @@
       </w:hyperlink>
     </w:p>
     <w:p>
-      <w:pPr>
-        <w:spacing w:after="40"/>
-      </w:pPr>
-      <w:hyperlink w:anchor="h_a_closing_word">
-        <w:r>
-          <w:rPr>
-            <w:color w:val="0C2D5A"/>
-            <w:u w:val="single"/>
-          </w:rPr>
-          <w:t xml:space="preserve">A Closing Word</w:t>
-        </w:r>
-      </w:hyperlink>
-    </w:p>
-    <w:p>
       <w:bookmarkStart w:id="1" w:name="h_how_to_read_this_book"/>
       <w:pPr>
         <w:pStyle w:val="Heading1"/>
@@ -783,7 +783,7 @@
     </w:p>
     <w:p>
       <w:r>
-        <w:t>Parts II to VIII are the full guide. They take the same steps apart with the complete arithmetic: both royalty plans line by line, the keyword and category fields, launch week, ads and break-even ACOS, taxes and payments, KDP Select against going wide, the traps that cost new authors money, building a catalog, the first-review problem in depth, and using AI without losing the business. The appendices hold a one-page launch checklist and a royalty quick reference.</w:t>
+        <w:t>Parts II to VIII are the full guide. They take the same steps apart with the complete arithmetic: both royalty plans line by line, the keyword and category fields, launch week, ads and break-even ACOS, taxes and payments, KDP Select against going wide, the traps that cost new authors money, building a catalog, the first-review problem in depth, and using AI without losing the business. A short closing word ties the two halves together, and the appendices after it hold a one-page launch checklist, a royalty quick reference, a glossary, and the official sources.</w:t>
       </w:r>
     </w:p>
     <w:p>
@@ -3253,7 +3253,12 @@
     </w:p>
     <w:p>
       <w:r>
-        <w:t>This book makes you one promise: every number in it comes with the arithmetic attached. When it says a 70% royalty, it shows you what’s subtracted before that 70% ever reaches your account. When it says a category trick works, it tells you which part is a documented KDP mechanism and which part is a reasonable-but-unverifiable inference about how the algorithm behaves. When a chart is illustrating a shape rather than a disclosed statistic — a pricing curve, a launch-week effect, a backlist compounding over years — its caption says so, in words, on the chart itself. Nobody selling you a course about “the Amazon algorithm” actually has its source code, and a book that pretends otherwise is the first warning sign covered in Chapter 28.</w:t>
+        <w:t>Part I walked one book through one month with rounded numbers and one action per chapter. The full guide covers the same ground again, slower and in production order: the landscape and the money (Part II), making the book (Part III), getting it found (Part IV), the business plumbing (Part V), the long game (Part VI), and two topics in depth, reviews and AI (Parts VII and VIII). Where Part I already gave a rule in full, the chapters here point back to it rather than repeat it.</w:t>
+      </w:r>
+    </w:p>
+    <w:p>
+      <w:r>
+        <w:t>The full guide makes you one promise: every number in it comes with the arithmetic attached. When it says a 70% royalty, it shows you what’s subtracted before that 70% ever reaches your account. When it says a category trick works, it tells you which part is a documented KDP mechanism and which part is a reasonable-but-unverifiable inference about how the algorithm behaves. When a chart is illustrating a shape rather than a disclosed statistic — a pricing curve, a launch-week effect, a backlist compounding over years — its caption says so, in words, on the chart itself. Nobody selling you a course about “the Amazon algorithm” actually has its source code, and a book that pretends otherwise is the first warning sign covered in Chapter 28.</w:t>
       </w:r>
     </w:p>
     <w:p>
@@ -3561,7 +3566,7 @@
     </w:p>
     <w:p>
       <w:r>
-        <w:t>For a sense of scale with a real book instead of a round number: this book runs about 33,500 words. Amazon doesn’t publish its exact KENPC formula, but the figure self-publishers have reverse-engineered by comparing known word counts against observed KENPC values clusters around 250 words per normalized page — which would put this book at roughly 134 KENPC pages, and one full Kindle Unlimited read of it at around $0.60 at the rate used above. Treat that as an estimate, not a receipt; the point is that a word count and a KU payout are the same number wearing different clothes.</w:t>
+        <w:t>For a sense of scale with a real book instead of a round number: this book runs about 33,700 words. Amazon doesn’t publish its exact KENPC formula, but the figure self-publishers have reverse-engineered by comparing known word counts against observed KENPC values clusters around 250 words per normalized page — which would put this book at roughly 135 KENPC pages, and one full Kindle Unlimited read of it at around $0.60 at the rate used above. Treat that as an estimate, not a receipt; the point is that a word count and a KU payout are the same number wearing different clothes.</w:t>
       </w:r>
     </w:p>
     <w:p>
@@ -8314,14 +8319,39 @@
       </w:r>
     </w:p>
     <w:p>
-      <w:bookmarkStart w:id="42" w:name="h_appendix_a_the_one_page_launch_check"/>
+      <w:bookmarkStart w:id="42" w:name="h_a_closing_word"/>
       <w:pPr>
         <w:pStyle w:val="Heading1"/>
       </w:pPr>
       <w:r>
+        <w:t>A Closing Word</w:t>
+      </w:r>
+      <w:bookmarkEnd w:id="42"/>
+    </w:p>
+    <w:p>
+      <w:r>
+        <w:t>Nothing in this book is complicated on its own. Royalty math is arithmetic. Keyword slots are a form field. A launch is a calendar with the same events moved closer together. What makes self-publishing hard isn’t any individual step — it’s that all thirty-two chapters’ worth of steps land on one person, and it’s tempting to skip the unglamorous ones (a real editing pass, an honest category choice, the tax interview) in favor of the exciting one (hitting publish).</w:t>
+      </w:r>
+    </w:p>
+    <w:p>
+      <w:r>
+        <w:t>The authors who make good money at this aren’t the ones who found a secret Amazon doesn’t want you to know. They’re the ones who did the plain, checkable, occasionally tedious work in every chapter of this book, on purpose, in order, and then did it again for the next book — because by the second time, most of it was already fixed cost, paid off. That’s the whole secret, and it was never actually a secret.</w:t>
+      </w:r>
+    </w:p>
+    <w:p>
+      <w:r>
+        <w:t>If you remember one thing from both halves of this book, make it the keep test from Part I: before you spend money or a week, write what one sale leaves you, who the book is for and who it is not for, and the one change you will make and the day you will look. Every chapter after that is the same three lines, worked out in more detail. The checklist, the royalty reference, and the official sources follow, for the day you sit down to publish. Go write something worth finding.</w:t>
+      </w:r>
+    </w:p>
+    <w:p>
+      <w:bookmarkStart w:id="43" w:name="h_appendix_a_the_one_page_launch_check"/>
+      <w:pPr>
+        <w:pStyle w:val="Heading1"/>
+      </w:pPr>
+      <w:r>
         <w:t>Appendix A — The One-Page Launch Checklist</w:t>
       </w:r>
-      <w:bookmarkEnd w:id="42"/>
+      <w:bookmarkEnd w:id="43"/>
     </w:p>
     <w:p>
       <w:r>
@@ -8524,14 +8554,14 @@
       </w:r>
     </w:p>
     <w:p>
-      <w:bookmarkStart w:id="43" w:name="h_appendix_b_royalty_quick_reference"/>
+      <w:bookmarkStart w:id="44" w:name="h_appendix_b_royalty_quick_reference"/>
       <w:pPr>
         <w:pStyle w:val="Heading1"/>
       </w:pPr>
       <w:r>
         <w:t>Appendix B — Royalty Quick Reference</w:t>
       </w:r>
-      <w:bookmarkEnd w:id="43"/>
+      <w:bookmarkEnd w:id="44"/>
     </w:p>
     <w:p>
       <w:r>
@@ -8622,14 +8652,14 @@
       </w:r>
     </w:p>
     <w:p>
-      <w:bookmarkStart w:id="44" w:name="h_appendix_c_isbns_wide_distribution_a"/>
+      <w:bookmarkStart w:id="45" w:name="h_appendix_c_isbns_wide_distribution_a"/>
       <w:pPr>
         <w:pStyle w:val="Heading1"/>
       </w:pPr>
       <w:r>
         <w:t>Appendix C — ISBNs, Wide Distribution, and Further Reading</w:t>
       </w:r>
-      <w:bookmarkEnd w:id="44"/>
+      <w:bookmarkEnd w:id="45"/>
     </w:p>
     <w:p>
       <w:pPr>
@@ -8704,14 +8734,14 @@
       </w:r>
     </w:p>
     <w:p>
-      <w:bookmarkStart w:id="45" w:name="h_glossary"/>
+      <w:bookmarkStart w:id="46" w:name="h_glossary"/>
       <w:pPr>
         <w:pStyle w:val="Heading1"/>
       </w:pPr>
       <w:r>
         <w:t>Glossary</w:t>
       </w:r>
-      <w:bookmarkEnd w:id="45"/>
+      <w:bookmarkEnd w:id="46"/>
     </w:p>
     <w:p>
       <w:r>
@@ -8750,7 +8780,7 @@
     </w:p>
     <w:p>
       <w:r>
-        <w:t>KDP Select. A 90-day enrollment. Page reads may pay you. The ebook stays exclusive to Kindle for the term. Chapter 8. [5]</w:t>
+        <w:t>KDP Select. A 90-day enrollment. Page reads may pay you. The ebook stays exclusive to Kindle for the term. Idea 8 in chapter 8; chapter 27 in full. [5]</w:t>
       </w:r>
     </w:p>
     <w:p>
@@ -8764,14 +8794,14 @@
       </w:r>
     </w:p>
     <w:p>
-      <w:bookmarkStart w:id="46" w:name="h_official_sources"/>
+      <w:bookmarkStart w:id="47" w:name="h_official_sources"/>
       <w:pPr>
         <w:pStyle w:val="Heading1"/>
       </w:pPr>
       <w:r>
         <w:t>Official sources</w:t>
       </w:r>
-      <w:bookmarkEnd w:id="46"/>
+      <w:bookmarkEnd w:id="47"/>
     </w:p>
     <w:p>
       <w:r>
@@ -8973,26 +9003,6 @@
     <w:p>
       <w:r>
         <w:t>Independent guide. Not affiliated with or endorsed by Amazon. Check the live help pages before you act.</w:t>
-      </w:r>
-    </w:p>
-    <w:p>
-      <w:bookmarkStart w:id="47" w:name="h_a_closing_word"/>
-      <w:pPr>
-        <w:pStyle w:val="Heading1"/>
-      </w:pPr>
-      <w:r>
-        <w:t>A Closing Word</w:t>
-      </w:r>
-      <w:bookmarkEnd w:id="47"/>
-    </w:p>
-    <w:p>
-      <w:r>
-        <w:t>Nothing in this book is complicated on its own. Royalty math is arithmetic. Keyword slots are a form field. A launch is a calendar with the same events moved closer together. What makes self-publishing hard isn’t any individual step — it’s that all thirty-two chapters’ worth of steps land on one person, and it’s tempting to skip the unglamorous ones (a real editing pass, an honest category choice, the tax interview) in favor of the exciting one (hitting publish).</w:t>
-      </w:r>
-    </w:p>
-    <w:p>
-      <w:r>
-        <w:t>The authors who make good money at this aren’t the ones who found a secret Amazon doesn’t want you to know. They’re the ones who did the plain, checkable, occasionally tedious work in every chapter of this book, on purpose, in order, and then did it again for the next book — because by the second time, most of it was already fixed cost, paid off. That’s the whole secret, and it was never actually a secret. Go write something worth finding.</w:t>
       </w:r>
     </w:p>
     <w:sectPr>

</xml_diff>

<commit_message>
﻿Your First Book That Sells: Ch 32 adds Who owns what the AI wrote? (human authorship, Thaler v. Perlmutter, permission vs ownership, publishing AI conversations)
</commit_message>
<xml_diff>
--- a/Your First Book That Sells/Your First Book That Sells.docx
+++ b/Your First Book That Sells/Your First Book That Sells.docx
@@ -7894,7 +7894,7 @@
     </w:p>
     <w:p>
       <w:r>
-        <w:t>Chapter 19 already covered the core rule for AI in your manuscript: it can speed up the unglamorous parts of writing, disclosure to KDP is mandatory, and a human stays the last editorial judgment. Chapter 28 covered the volume version of misusing it — flooding categories with thin, minimally reviewed AI output. This chapter is the rest of it: where AI genuinely helps everywhere else in the business, the disclosure rule stated in full, and the one line that separates “AI helped me write my book” from “I laundered someone else’s” — because that line gets crossed by processes that sound perfectly professional right up until the step that gives them away.</w:t>
+        <w:t>Chapter 19 already covered the core rule for AI in your manuscript: it can speed up the unglamorous parts of writing, disclosure to KDP is mandatory, and a human stays the last editorial judgment. Chapter 28 covered the volume version of misusing it — flooding categories with thin, minimally reviewed AI output. This chapter is the rest of it: where AI genuinely helps everywhere else in the business, the disclosure rule stated in full, who owns what an AI writes, and the one line that separates “AI helped me write my book” from “I laundered someone else’s” — because that line gets crossed by processes that sound perfectly professional right up until the step that gives them away.</w:t>
       </w:r>
     </w:p>
     <w:p>
@@ -8111,6 +8111,132 @@
         <w:pStyle w:val="Heading3"/>
       </w:pPr>
       <w:r>
+        <w:t>Who owns what the AI wrote?</w:t>
+      </w:r>
+    </w:p>
+    <w:p>
+      <w:r>
+        <w:t>Disclosure answers what Amazon needs to know. Ownership is a separate question, and the answer surprises most people: in the United States, text an AI produced on its own belongs to nobody.</w:t>
+      </w:r>
+    </w:p>
+    <w:p>
+      <w:r>
+        <w:t xml:space="preserve">The rule is the human-authorship requirement. The U.S. Copyright Office will not register material whose expressive content was generated by a machine, and the courts have backed it. In </w:t>
+      </w:r>
+      <w:r>
+        <w:rPr>
+          <w:i/>
+        </w:rPr>
+        <w:t>Thaler v. Perlmutter</w:t>
+      </w:r>
+      <w:r>
+        <w:t>, the U.S. Court of Appeals for the D.C. Circuit held in March 2025 that the Copyright Act requires a human author. On March 2, 2026, the Supreme Court declined to hear the appeal, which leaves that ruling standing. Declining a case is not a Supreme Court ruling on the merits, but the practical position today is clear: a work with no human author has no copyright.</w:t>
+      </w:r>
+    </w:p>
+    <w:p>
+      <w:r>
+        <w:t>That does not leave AI-assisted books unprotected. The same appeals ruling says the requirement does not bar works made with the help of AI; what counts is the human contribution. Your own sentences are yours. So are your creative selection and arrangement of material and your creative changes to it. What stays unprotected is the machine-written expression itself. In its January 2025 report on copyrightability, the Copyright Office concluded that prompts alone, however detailed or often revised, do not make you the author of what comes back. How much human shaping turns AI material into your work is still being argued in court, so don't plan a business around the generous end of that line. Other countries draw it differently (the United Kingdom, for one, has a separate rule for computer-generated works), so check the law where you sell if a book depends on it.</w:t>
+      </w:r>
+    </w:p>
+    <w:p>
+      <w:r>
+        <w:t>Here is where the usual mix-up happens. An AI service's terms typically say the output is yours to use. That is permission, not ownership. The company is promising not to claim the text against you; it cannot hand you a copyright the law says does not exist. You may publish the output, but you cannot stop anyone else from copying the parts no human wrote.</w:t>
+      </w:r>
+    </w:p>
+    <w:p>
+      <w:r>
+        <w:t>Take the most tempting case: you had a long, sharp conversation with a chatbot, say about whether time is real, and you want to turn it into a book.</w:t>
+      </w:r>
+    </w:p>
+    <w:p>
+      <w:pPr>
+        <w:pStyle w:val="ListBullet"/>
+      </w:pPr>
+      <w:r>
+        <w:rPr>
+          <w:b/>
+        </w:rPr>
+        <w:t>You may.</w:t>
+      </w:r>
+      <w:r>
+        <w:t xml:space="preserve"> Check that service's terms first; most allow it.</w:t>
+      </w:r>
+    </w:p>
+    <w:p>
+      <w:pPr>
+        <w:pStyle w:val="ListBullet"/>
+      </w:pPr>
+      <w:r>
+        <w:rPr>
+          <w:b/>
+        </w:rPr>
+        <w:t>Disclose it.</w:t>
+      </w:r>
+      <w:r>
+        <w:t xml:space="preserve"> Every answer the AI wrote is AI-generated content under the KDP rule above, however much you trimmed it.</w:t>
+      </w:r>
+    </w:p>
+    <w:p>
+      <w:pPr>
+        <w:pStyle w:val="ListBullet"/>
+      </w:pPr>
+      <w:r>
+        <w:rPr>
+          <w:b/>
+        </w:rPr>
+        <w:t>Know what you own.</w:t>
+      </w:r>
+      <w:r>
+        <w:t xml:space="preserve"> Your questions, your commentary, your creative edits, and your choice and ordering of excerpts can be protected. The AI's paragraphs, copied as they came, cannot, and a competitor could lift them.</w:t>
+      </w:r>
+    </w:p>
+    <w:p>
+      <w:pPr>
+        <w:pStyle w:val="ListBullet"/>
+      </w:pPr>
+      <w:r>
+        <w:rPr>
+          <w:b/>
+        </w:rPr>
+        <w:t>Make it yours.</w:t>
+      </w:r>
+      <w:r>
+        <w:t xml:space="preserve"> The more of the finished book is your own explanation, argument, and structure, the more of it you own and the more there is for a reader to buy. A transcript with a cover is the weakest version of the idea. A book that uses the conversation as raw material is the strongest.</w:t>
+      </w:r>
+    </w:p>
+    <w:p>
+      <w:pPr>
+        <w:pStyle w:val="ListBullet"/>
+      </w:pPr>
+      <w:r>
+        <w:rPr>
+          <w:b/>
+        </w:rPr>
+        <w:t>Save the transcript and every draft.</w:t>
+      </w:r>
+      <w:r>
+        <w:t xml:space="preserve"> A chat service may not keep the conversation, and the AI will not remember it in a new session. Dated prompts, outputs, and revisions are also your evidence of what the human contributed if ownership is ever questioned.</w:t>
+      </w:r>
+    </w:p>
+    <w:p>
+      <w:pPr>
+        <w:ind w:left="504" w:right="288"/>
+      </w:pPr>
+      <w:r>
+        <w:rPr>
+          <w:b/>
+        </w:rPr>
+        <w:t>Key takeaway:</w:t>
+      </w:r>
+      <w:r>
+        <w:t xml:space="preserve"> "The terms say the output is mine" means you may use it. It does not mean you own it. In the U.S., only the human-authored parts of an AI-assisted book carry copyright, so the more of the book you actually wrote, the more of it is yours.</w:t>
+      </w:r>
+    </w:p>
+    <w:p>
+      <w:pPr>
+        <w:pStyle w:val="Heading3"/>
+      </w:pPr>
+      <w:r>
         <w:t>The trap that looks like a process</w:t>
       </w:r>
     </w:p>
@@ -8321,7 +8447,7 @@
         <w:rPr>
           <w:i/>
         </w:rPr>
-        <w:t>Sources: KDP Help: Content Guidelines (G200672390); U.S. Copyright Act §102(b); U.S. Copyright Office Fair Use Index; U.S. Copyright Office Circular 15A (Duration of Copyright). General principles only, not legal advice — get a lawyer for a specific manuscript, not a book chapter.</w:t>
+        <w:t>Sources: KDP Help: Content Guidelines (G200672390); Thaler v. Perlmutter, 130 F.4th 1039 (D.C. Cir. 2025), cert. denied (U.S. Mar. 2, 2026); U.S. Copyright Office, Copyright and Artificial Intelligence, Part 2: Copyrightability (January 2025); U.S. Copyright Act §102(b); U.S. Copyright Office Fair Use Index; U.S. Copyright Office Circular 15A (Duration of Copyright). General principles only, not legal advice — get a lawyer for a specific manuscript, not a book chapter.</w:t>
       </w:r>
     </w:p>
     <w:p>

</xml_diff>

<commit_message>
Your First Book That Sells: curly-quote sweep, also-by apostrophes (from PR #50), pen-name decision note
</commit_message>
<xml_diff>
--- a/Your First Book That Sells/Your First Book That Sells.docx
+++ b/Your First Book That Sells/Your First Book That Sells.docx
@@ -4971,7 +4971,7 @@
         <w:drawing>
           <wp:inline xmlns:a="http://schemas.openxmlformats.org/drawingml/2006/main" xmlns:pic="http://schemas.openxmlformats.org/drawingml/2006/picture">
             <wp:extent cx="4023360" cy="2514600"/>
-            <wp:docPr id="7" name="Picture 7" descr="Six boxes showing how a shopper reads a product page: thumbnail, title and subtitle, first two lines, bullets and fit, sample, and price and reviews, each with the shopper's question; below, the content KDP does not allow in a description."/>
+            <wp:docPr id="7" name="Picture 7" descr="Six boxes showing how a shopper reads a product page: thumbnail, title and subtitle, first two lines, bullets and fit, sample, and price and reviews, each with the shopper’s question; below, the content KDP does not allow in a description."/>
             <wp:cNvGraphicFramePr>
               <a:graphicFrameLocks noChangeAspect="1"/>
             </wp:cNvGraphicFramePr>
@@ -11031,7 +11031,7 @@
         <w:pStyle w:val="ListBullet"/>
       </w:pPr>
       <w:r>
-        <w:t>The Dolphins' View of History</w:t>
+        <w:t>The Dolphins’ View of History</w:t>
       </w:r>
     </w:p>
     <w:p>
@@ -11047,7 +11047,7 @@
         <w:pStyle w:val="ListBullet"/>
       </w:pPr>
       <w:r>
-        <w:t>The Murder That Hadn't Happened Yet (The Relativistic Investigation Bureau, Book 1)</w:t>
+        <w:t>The Murder That Hadn’t Happened Yet (The Relativistic Investigation Bureau, Book 1)</w:t>
       </w:r>
     </w:p>
     <w:p>

</xml_diff>

<commit_message>
Your First Book That Sells: author is the pen name Kevin Drew Peters (cover, title page, KDP files, build script, About the Author)
</commit_message>
<xml_diff>
--- a/Your First Book That Sells/Your First Book That Sells.docx
+++ b/Your First Book That Sells/Your First Book That Sells.docx
@@ -29,7 +29,7 @@
           <w:b/>
           <w:sz w:val="32"/>
         </w:rPr>
-        <w:t>Lothar J. Musiol</w:t>
+        <w:t>Kevin Drew Peters</w:t>
       </w:r>
     </w:p>
     <w:p>
@@ -45,7 +45,7 @@
     </w:p>
     <w:p>
       <w:r>
-        <w:t>Copyright © 2026 Lothar J. Musiol. All rights reserved.</w:t>
+        <w:t>Copyright © 2026 Kevin Drew Peters. All rights reserved.</w:t>
       </w:r>
     </w:p>
     <w:p>
@@ -898,13 +898,13 @@
       <w:pPr>
         <w:spacing w:after="40"/>
       </w:pPr>
-      <w:hyperlink w:anchor="h_also_by_lothar_j_musiol">
+      <w:hyperlink w:anchor="h_also_by_kevin_drew_peters">
         <w:r>
           <w:rPr>
             <w:color w:val="0C2D5A"/>
             <w:u w:val="single"/>
           </w:rPr>
-          <w:t xml:space="preserve">Also by Lothar J. Musiol</w:t>
+          <w:t xml:space="preserve">Also by Kevin Drew Peters</w:t>
         </w:r>
       </w:hyperlink>
     </w:p>
@@ -1014,7 +1014,7 @@
     </w:p>
     <w:p>
       <w:r>
-        <w:t>Lothar J. Musiol is a graduate of Munich University of Applied Sciences. He spent many years in the semiconductor industry, most of them in the United States, supporting several start-ups. That work teaches a habit: measure before you decide, write the arithmetic down, change one variable at a time, and put a cap on the cost of every experiment.</w:t>
+        <w:t>Kevin Drew Peters is a graduate of Munich University of Applied Sciences. He spent many years in the semiconductor industry, most of them in the United States, supporting several start-ups. That work teaches a habit: measure before you decide, write the arithmetic down, change one variable at a time, and put a cap on the cost of every experiment.</w:t>
       </w:r>
     </w:p>
     <w:p>
@@ -10779,7 +10779,7 @@
     </w:p>
     <w:p>
       <w:r>
-        <w:t>Lothar J. Musiol is a graduate of Munich University of Applied Sciences. He spent many years in the semiconductor industry, mostly in the United States, supporting several start-ups, where a decision was only as good as the measurement behind it and a budget was a hypothesis until the numbers came back.</w:t>
+        <w:t>Kevin Drew Peters is a graduate of Munich University of Applied Sciences. He spent many years in the semiconductor industry, mostly in the United States, supporting several start-ups, where a decision was only as good as the measurement behind it and a budget was a hypothesis until the numbers came back.</w:t>
       </w:r>
     </w:p>
     <w:p>
@@ -10793,12 +10793,12 @@
       </w:r>
     </w:p>
     <w:p>
-      <w:bookmarkStart w:id="87" w:name="h_also_by_lothar_j_musiol"/>
+      <w:bookmarkStart w:id="87" w:name="h_also_by_kevin_drew_peters"/>
       <w:pPr>
         <w:pStyle w:val="Heading1"/>
       </w:pPr>
       <w:r>
-        <w:t>Also by Lothar J. Musiol</w:t>
+        <w:t>Also by Kevin Drew Peters</w:t>
       </w:r>
       <w:bookmarkEnd w:id="87"/>
     </w:p>

</xml_diff>

<commit_message>
Audit fixes for Your First Book That Sells: corrections, stale references, unprovable claims removed
Co-Authored-By: Claude Sonnet 5.5 <noreply@anthropic.com>
Claude-Session: https://claude.ai/code/session_017Lt24PE78rg9YLZresequ9
</commit_message>
<xml_diff>
--- a/Your First Book That Sells/Your First Book That Sells.docx
+++ b/Your First Book That Sells/Your First Book That Sells.docx
@@ -55,7 +55,31 @@
     </w:p>
     <w:p>
       <w:r>
-        <w:t>This book is a general educational guide. Amazon’s KDP terms, royalty rates, tax rules, and advertising tools change over time and differ by marketplace. Every platform rule in this book was checked against Amazon’s own help pages on 3 October 2026 and carries a numbered note that leads to the page. Verify the current figures before you rely on them, and get professional advice for your own tax and legal situation.</w:t>
+        <w:t xml:space="preserve">This book is a general educational guide. Amazon’s KDP terms, royalty rates, tax rules, and advertising tools change over time and differ by marketplace. Every platform rule in this book was checked against Amazon’s own help pages on 3 October 2026 (notes </w:t>
+      </w:r>
+      <w:hyperlink w:anchor="note_31">
+        <w:r>
+          <w:rPr>
+            <w:color w:val="0C2D5A"/>
+            <w:u w:val="single"/>
+          </w:rPr>
+          <w:t xml:space="preserve">[31]</w:t>
+        </w:r>
+      </w:hyperlink>
+      <w:r>
+        <w:t xml:space="preserve"> to </w:t>
+      </w:r>
+      <w:hyperlink w:anchor="note_33">
+        <w:r>
+          <w:rPr>
+            <w:color w:val="0C2D5A"/>
+            <w:u w:val="single"/>
+          </w:rPr>
+          <w:t xml:space="preserve">[33]</w:t>
+        </w:r>
+      </w:hyperlink>
+      <w:r>
+        <w:t xml:space="preserve"> on 6 October 2026) and carries a numbered note that leads to the page. Verify the current figures before you rely on them, and get professional advice for your own tax and legal situation.</w:t>
       </w:r>
     </w:p>
     <w:p>
@@ -149,13 +173,13 @@
       <w:pPr>
         <w:spacing w:after="40"/>
       </w:pPr>
-      <w:hyperlink w:anchor="h_part_i_the_short_road_one_month_with">
+      <w:hyperlink w:anchor="h_part_i_the_short_road_one_book_one_a">
         <w:r>
           <w:rPr>
             <w:color w:val="0C2D5A"/>
             <w:u w:val="single"/>
           </w:rPr>
-          <w:t xml:space="preserve">Part I — The Short Road: One Month with One Book</w:t>
+          <w:t xml:space="preserve">Part I — The Short Road: One Book, One Action at a Time</w:t>
         </w:r>
       </w:hyperlink>
     </w:p>
@@ -1034,7 +1058,7 @@
     </w:p>
     <w:p>
       <w:r>
-        <w:t>This book applies that habit to Kindle publishing. What you will get: the platform rules with their sources and dates, the arithmetic behind every price and every ad, and small bounded tests you can run on your own book. What you will not get: the author’s own sales figures held up as proof, stories of overnight success, or a claim to know how Amazon ranks books. Amazon does not publish its ranking algorithm, and nobody outside Amazon has it.</w:t>
+        <w:t>This book applies that habit to Kindle publishing. What you will get: the platform rules with their sources and dates, the arithmetic behind every price and every ad, and small bounded tests you can run on your own book. What you will not get: the author’s own sales figures held up as proof, stories of overnight success, or a claim to know how Amazon ranks books. Amazon does not publish its ranking algorithm.</w:t>
       </w:r>
     </w:p>
     <w:p>
@@ -1049,7 +1073,7 @@
     </w:p>
     <w:p>
       <w:r>
-        <w:t>Part I is the short road: fifteen short chapters, one action each, and a one-page plan for your first week. You follow one first-time author and her cozy mystery through one month. She is a teaching example, not a real person. If you read only Part I, you can publish honestly and know what each sale pays you.</w:t>
+        <w:t>Part I is the short road: fifteen short chapters, one action each, and a one-page plan for your first week. You follow one first-time author and her cozy mystery through her first months of decisions. She is a teaching example, not a real person. If you read only Part I, you can publish honestly and know what each sale pays you.</w:t>
       </w:r>
     </w:p>
     <w:p>
@@ -1133,12 +1157,12 @@
       </w:r>
     </w:p>
     <w:p>
-      <w:bookmarkStart w:id="6" w:name="h_part_i_the_short_road_one_month_with"/>
+      <w:bookmarkStart w:id="6" w:name="h_part_i_the_short_road_one_book_one_a"/>
       <w:pPr>
         <w:pStyle w:val="Heading1"/>
       </w:pPr>
       <w:r>
-        <w:t>Part I — The Short Road: One Month with One Book</w:t>
+        <w:t>Part I — The Short Road: One Book, One Action at a Time</w:t>
       </w:r>
       <w:bookmarkEnd w:id="6"/>
     </w:p>
@@ -1154,7 +1178,7 @@
     </w:p>
     <w:p>
       <w:r>
-        <w:t>Picture a first-time author with a finished cozy mystery and a price of $0.99 in her head. She has not asked what one sale would leave her. Part I is the month she finds out. She is a teaching example, and every number in her month is a worked example, not a report.</w:t>
+        <w:t>Picture a first-time author with a finished cozy mystery and a price of $0.99 in her head. She has not asked what one sale would leave her. Part I is how she finds out. She is a teaching example, and every number in her story is a worked example, not a report.</w:t>
       </w:r>
     </w:p>
     <w:p>
@@ -1323,12 +1347,12 @@
     </w:p>
     <w:p>
       <w:r>
-        <w:t>The second sentence matters as much as the first. A wrong buyer does not become a fan; they become a return, or a review saying the book was not what the page promised.</w:t>
-      </w:r>
-    </w:p>
-    <w:p>
-      <w:r>
-        <w:t xml:space="preserve">Then look at five books your reader already buys and write down the words those books share and their readers use. For her shelf: small town cozy mystery, amateur sleuth inn mystery, clean mystery no gore, village puzzle mystery, quiet village detective. Those phrases come back in </w:t>
+        <w:t>The second sentence matters as much as the first. A wrong buyer is unlikely to become a fan; they may return the book or write a review saying it was not what the page promised.</w:t>
+      </w:r>
+    </w:p>
+    <w:p>
+      <w:r>
+        <w:t xml:space="preserve">Then look at five books your reader already buys and write down the words those books share and their readers use. For her shelf: small town sleuth, amateur detective inn, clean no gore, village puzzle, quiet village detective. Those phrases come back in </w:t>
       </w:r>
       <w:hyperlink w:anchor="ch_5">
         <w:r>
@@ -1752,7 +1776,7 @@
     </w:p>
     <w:p>
       <w:r>
-        <w:t>The cover, the description, the sample, and the book must promise the same thing. The first two sentences of the description do most of the work, because shoppers on a phone rarely reach paragraph four.</w:t>
+        <w:t>The cover, the description, the sample, and the book must promise the same thing. Put the promise in the first two sentences of the description, because they are what a shopper on a phone sees first.</w:t>
       </w:r>
     </w:p>
     <w:p>
@@ -1801,7 +1825,7 @@
         <w:t>The thumbnail test.</w:t>
       </w:r>
       <w:r>
-        <w:t xml:space="preserve"> Shrink your cover until it is about the size of a postage stamp, or look at it on your phone’s screen at arm’s length. You must still read the title, and you must still know what kind of book it is. A quiet mystery should not look like a thriller or a textbook. Do not rely on colour alone; some screens show the cover in gray. If the title fails, the rest of the design does not matter yet. </w:t>
+        <w:t xml:space="preserve"> Shrink your cover until it is about the size of a postage stamp, or look at it on your phone’s screen at arm’s length. You must still read the title, and you must still know what kind of book it is. A quiet mystery should not look like a thriller or a textbook. Do not rely on color alone; some screens show the cover in gray. If the title fails, the rest of the design does not matter yet. </w:t>
       </w:r>
       <w:hyperlink w:anchor="ch_22">
         <w:r>
@@ -1836,7 +1860,19 @@
         </w:r>
       </w:hyperlink>
       <w:r>
-        <w:t>, not single words such as “book.” Her seven: small town cozy mystery, amateur sleuth inn mystery, clean mystery no gore, village puzzle mystery, quiet village detective, gentle puzzle novel, weekend mystery book.</w:t>
+        <w:t>, not single words such as “book.” Her seven: small town sleuth, amateur detective inn, clean no gore, village puzzle, quiet village detective, gentle puzzle novel, weekend read. She leaves out the word “mystery”, because her category already carries it (</w:t>
+      </w:r>
+      <w:hyperlink w:anchor="ch_23">
+        <w:r>
+          <w:rPr>
+            <w:color w:val="0C2D5A"/>
+            <w:u w:val="single"/>
+          </w:rPr>
+          <w:t xml:space="preserve">Chapter 23</w:t>
+        </w:r>
+      </w:hyperlink>
+      <w:r>
+        <w:t>).</w:t>
       </w:r>
     </w:p>
     <w:p>
@@ -1925,7 +1961,7 @@
         <w:t>.</w:t>
       </w:r>
       <w:r>
-        <w:t xml:space="preserve"> You may give readers a free or discounted copy as long as you do not require a review and do not try to influence it. Offering anything beyond the book, such as a gift card, a refund, or a favour, invalidates the review. Amazon does not allow reviews from the author, or from friends, relatives, employers, business associates, competitors, or anyone with a financial interest in the book. Do not buy reviews, trade reviews with other authors, or ask anyone to change a rating.</w:t>
+        <w:t xml:space="preserve"> You may give readers a free or discounted copy as long as you do not require a review and do not try to influence it. Offering anything beyond the book, such as a gift card, a refund, or a favor, invalidates the review. Amazon does not allow reviews from the author, or from friends, relatives, employers, business associates, competitors, or anyone with a financial interest in the book. Do not buy reviews, trade reviews with other authors, or ask anyone to change a rating.</w:t>
       </w:r>
     </w:p>
     <w:p>
@@ -2097,7 +2133,7 @@
         </w:r>
       </w:hyperlink>
       <w:r>
-        <w:t xml:space="preserve"> lists thirty-two, each with its smallest version and the number that means stop. This month, pick only three: one price, one next book (even if it is only a sentence), and one format or short extra.</w:t>
+        <w:t xml:space="preserve"> lists thirty-two, each with its smallest version and the sign to stop. This month, pick only three, each from a different section: Price, The next book, Formats and extras, or Reach.</w:t>
       </w:r>
     </w:p>
     <w:p>
@@ -2113,7 +2149,19 @@
         <w:t>Worked example.</w:t>
       </w:r>
       <w:r>
-        <w:t xml:space="preserve"> Her first idea is the price. At $0.99 she sold 20 copies in four quiet weeks and kept about $7. She changed only the price, to $3.99, and over the next four weeks sold 12 copies and kept about $31. Fewer sales, more money. She held the price four more weeks before believing it.</w:t>
+        <w:t xml:space="preserve"> Her first idea is the price. At $0.99 she sold 20 copies in four quiet weeks and kept about $7. She changed only the price, to $3.99, and over the next four weeks sold 12 copies and kept about $31. Fewer sales, more money. She held the price through her ad test in </w:t>
+      </w:r>
+      <w:hyperlink w:anchor="ch_9">
+        <w:r>
+          <w:rPr>
+            <w:color w:val="0C2D5A"/>
+            <w:u w:val="single"/>
+          </w:rPr>
+          <w:t xml:space="preserve">Chapter 9</w:t>
+        </w:r>
+      </w:hyperlink>
+      <w:r>
+        <w:t xml:space="preserve"> before believing it.</w:t>
       </w:r>
     </w:p>
     <w:p>
@@ -2138,7 +2186,7 @@
         </w:r>
       </w:hyperlink>
       <w:r>
-        <w:t>, one of each kind, and write a look-date next to each.</w:t>
+        <w:t>, each from a different section, and write a look-date next to each.</w:t>
       </w:r>
     </w:p>
     <w:p>
@@ -2562,7 +2610,31 @@
     </w:p>
     <w:p>
       <w:r>
-        <w:t>Copy this shape and fill in your own lines. Her numbers are a worked example, not a report.</w:t>
+        <w:t xml:space="preserve">Copy this shape and fill in your own lines. Her numbers are a worked example, not a report. This is her third month, after the price test in </w:t>
+      </w:r>
+      <w:hyperlink w:anchor="ch_8">
+        <w:r>
+          <w:rPr>
+            <w:color w:val="0C2D5A"/>
+            <w:u w:val="single"/>
+          </w:rPr>
+          <w:t xml:space="preserve">Chapter 8</w:t>
+        </w:r>
+      </w:hyperlink>
+      <w:r>
+        <w:t xml:space="preserve"> and with the ad from </w:t>
+      </w:r>
+      <w:hyperlink w:anchor="ch_9">
+        <w:r>
+          <w:rPr>
+            <w:color w:val="0C2D5A"/>
+            <w:u w:val="single"/>
+          </w:rPr>
+          <w:t xml:space="preserve">Chapter 9</w:t>
+        </w:r>
+      </w:hyperlink>
+      <w:r>
+        <w:t>.</w:t>
       </w:r>
     </w:p>
     <w:tbl>
@@ -3335,7 +3407,7 @@
     </w:p>
     <w:p>
       <w:r>
-        <w:t>Part I walked one book through one month with one action per chapter. The full guide goes back over the same ground in production order and adds what Part I left out: the edge cases, the marketplace detail, the reasons, and the tests. It does not re-teach Part I. Where a rule was given there in full, the chapters here name the chapter and assume the figure is already on your sheet.</w:t>
+        <w:t>Part I walked one book through its first months with one action per chapter. The full guide goes back over the same ground in production order and adds what Part I left out: the edge cases, the marketplace detail, the reasons, and the tests. It does not re-teach Part I. Where a rule was given there in full, the chapters here name the chapter and assume the figure is already on your sheet.</w:t>
       </w:r>
     </w:p>
     <w:p>
@@ -3355,7 +3427,19 @@
     </w:p>
     <w:p>
       <w:r>
-        <w:t>Self-publishing through Kindle Direct Publishing (KDP) turns a long chain of agents, editors, and contracts into one step: you upload a file, set a price, and the book usually goes on sale within about 72 hours, with no one’s permission but your own. The barrier to publishing dropped to almost nothing. The barrier to publishing well did not move. This book is about the second barrier.</w:t>
+        <w:t xml:space="preserve">Self-publishing through Kindle Direct Publishing (KDP) turns a long chain of agents, editors, and contracts into one step: you upload a file, set a price, and, after KDP’s review, the book can take up to 72 hours to go live </w:t>
+      </w:r>
+      <w:hyperlink w:anchor="note_31">
+        <w:r>
+          <w:rPr>
+            <w:color w:val="0C2D5A"/>
+            <w:u w:val="single"/>
+          </w:rPr>
+          <w:t xml:space="preserve">[31]</w:t>
+        </w:r>
+      </w:hyperlink>
+      <w:r>
+        <w:t>. No agent or publisher has to say yes. Putting a book on sale takes little; publishing it well takes work, and this book is about the second part.</w:t>
       </w:r>
     </w:p>
     <w:p>
@@ -3368,12 +3452,12 @@
     </w:p>
     <w:p>
       <w:r>
-        <w:t>Traditional publishing pays an advance and a royalty set by contract, provides editing, design, and distribution, and takes control of price, cover, and timing. It moves on a timeline of years, and for a debut author without a platform the door is narrow.</w:t>
-      </w:r>
-    </w:p>
-    <w:p>
-      <w:r>
-        <w:t xml:space="preserve">Hybrid and vanity publishers charge the author to publish. A few are transparent about what each fee buys. Many charge high prices for things that cost little or nothing to do yourself, such as an ISBN, an ebook conversion, or a KDP upload. </w:t>
+        <w:t>Traditional publishing pays an advance and a royalty set by contract, provides editing, design, and distribution, and takes control of price, cover, and timing. It moves on a timeline of years, and for a debut author without a platform the door can be hard to open.</w:t>
+      </w:r>
+    </w:p>
+    <w:p>
+      <w:r>
+        <w:t xml:space="preserve">Hybrid and vanity publishers charge the author to publish. Some are transparent about what each fee buys. Others charge high prices for things that cost little or nothing to do yourself, such as an ISBN, an ebook conversion, or a KDP upload. </w:t>
       </w:r>
       <w:hyperlink w:anchor="ch_29">
         <w:r>
@@ -4016,7 +4100,7 @@
         <w:t>.</w:t>
       </w:r>
       <w:r>
-        <w:t xml:space="preserve"> If your ebook is in KDP Select, Kindle Unlimited subscribers can borrow it and you are paid for pages read, measured in Kindle Edition Normalized Pages (KENP), not your Word page count. Each month Amazon sets a KDP Select Global Fund, splits it among countries, and divides each country’s share by the pages read there. You can earn for at most 3,000 pages per title per customer. For July 2026 Amazon announced a fund of $67.6 million. KDP also runs a separate, discretionary monthly All Stars bonus for Select titles that reach certain customer-engagement marks, with its own pool size announced alongside the fund each month. Amazon does not publish a single per-page rate; your own royalty report shows what your pages earned, and monthly figures are finalised around the 15th of the following month.</w:t>
+        <w:t xml:space="preserve"> If your ebook is in KDP Select, Kindle Unlimited subscribers can borrow it and you are paid for pages read, measured in Kindle Edition Normalized Pages (KENP), not your Word page count. Each month Amazon sets a KDP Select Global Fund, splits it among countries, and divides each country’s share by the pages read there. You can earn for at most 3,000 pages per title per customer. For July 2026 Amazon announced a fund of $67.6 million. KDP also runs a separate, discretionary monthly All Stars bonus for Select titles that reach certain customer-engagement marks, with its own pool size announced alongside the fund each month. Amazon does not publish a single per-page rate; your own royalty report shows what your pages earned, and monthly figures are finalized around the 15th of the following month.</w:t>
       </w:r>
     </w:p>
     <w:p>
@@ -4321,7 +4405,7 @@
         <w:t>Field practice.</w:t>
       </w:r>
       <w:r>
-        <w:t xml:space="preserve"> Nonfiction authors often publish from an existing platform — a blog, a podcast, a channel — built before the book exists. Pat Flynn’s Smart Passive Income site, built years before his own books, is a widely known example of an audience preceding the book rather than the book building the audience cold, the way Part I’s launch does for a debut novelist with no list yet. Neither path is required, and the launch chapters (</w:t>
+        <w:t xml:space="preserve"> Nonfiction authors often publish from an existing platform — a blog, a podcast, a channel — built before the book exists. In that case the audience comes before the book, rather than the book building an audience cold, as Part I’s launch does for a debut novelist with no list yet. Neither path is required, and the launch chapters (</w:t>
       </w:r>
       <w:hyperlink w:anchor="ch_6">
         <w:r>
@@ -4457,10 +4541,10 @@
         <w:rPr>
           <w:b/>
         </w:rPr>
-        <w:t>Field practice.</w:t>
-      </w:r>
-      <w:r>
-        <w:t xml:space="preserve"> These are common checks, not Amazon rules. In the category you are considering:</w:t>
+        <w:t>Recommendation.</w:t>
+      </w:r>
+      <w:r>
+        <w:t xml:space="preserve"> These are suggested checks, not Amazon rules. In the category you are considering:</w:t>
       </w:r>
     </w:p>
     <w:p>
@@ -4500,7 +4584,7 @@
         <w:rPr>
           <w:b/>
         </w:rPr>
-        <w:t>Field practice.</w:t>
+        <w:t>Worked example.</w:t>
       </w:r>
       <w:r>
         <w:t xml:space="preserve"> A hypothetical beginner’s hobby guide: the top of the list is held by three books six to ten years old; two books published in the last 90 days already have dozens of reviews; four single-book authors sit in the top twenty; and the low-star reviews of all three leaders complain that there is no troubleshooting for humid climates. None of that guarantees a sale. It does give you a shelf with live buyers and one checkable gap to lead with in your subtitle and description (</w:t>
@@ -4528,7 +4612,7 @@
     </w:p>
     <w:p>
       <w:r>
-        <w:t>Writing to a shelf means knowing, before you draft, which existing shelf your book belongs on and what a reader there expects. It is the opposite of chasing a trend: by the time a trend shows on the charts, many authors have seen it. A book for one clearly defined reader, with a specific level, goal, and constraint, gives its cover, title, and sample one message to send.</w:t>
+        <w:t>Writing to a shelf means knowing, before you draft, which existing shelf your book belongs on and what a reader there expects. It is the opposite of chasing a trend: by the time a trend shows on the charts, other authors have already seen it. A book for one clearly defined reader, with a specific level, goal, and constraint, gives its cover, title, and sample one message to send.</w:t>
       </w:r>
     </w:p>
     <w:p>
@@ -4580,7 +4664,7 @@
     </w:p>
     <w:p>
       <w:r>
-        <w:t>A finished draft and a finished manuscript are not the same object. The gap between them is where most self-published books lose readers, because the person who wrote a book reads what they meant, not what is on the page.</w:t>
+        <w:t>A finished draft and a finished manuscript are not the same object. The gap between them is where books lose readers, because the person who wrote a book reads what they meant, not what is on the page.</w:t>
       </w:r>
     </w:p>
     <w:p>
@@ -4658,7 +4742,7 @@
         <w:pStyle w:val="ListBullet"/>
       </w:pPr>
       <w:r>
-        <w:t>Check every number and every cross-reference after the last reorganisation.</w:t>
+        <w:t>Check every number and every cross-reference after the last reorganization.</w:t>
       </w:r>
     </w:p>
     <w:p>
@@ -4877,7 +4961,7 @@
     </w:p>
     <w:p>
       <w:r>
-        <w:t xml:space="preserve">Shoppers scan a category page by pattern: they have learned what a thriller looks like, and what a business book looks like. </w:t>
+        <w:t xml:space="preserve">Shoppers may scan a category page by pattern, recognizing what a thriller or a business book usually looks like. </w:t>
       </w:r>
       <w:r>
         <w:rPr>
@@ -4926,7 +5010,7 @@
         <w:t>.</w:t>
       </w:r>
       <w:r>
-        <w:t xml:space="preserve"> The title, subtitle, and author name on the cover must match what you enter in KDP, and a cover may not closely imitate another book’s layout, colours, fonts, or images.</w:t>
+        <w:t xml:space="preserve"> The title, subtitle, and author name on the cover must match what you enter in KDP, and a cover may not closely imitate another book’s layout, colors, fonts, or images.</w:t>
       </w:r>
     </w:p>
     <w:p>
@@ -4942,7 +5026,7 @@
         <w:pStyle w:val="ListBullet"/>
       </w:pPr>
       <w:r>
-        <w:t>KDP’s Cover Creator is free and recognisable as a template: fine for testing, rarely enough for a book you will advertise.</w:t>
+        <w:t>KDP’s Cover Creator is free and recognizable as a template: fine for testing.</w:t>
       </w:r>
     </w:p>
     <w:p>
@@ -4950,16 +5034,7 @@
         <w:pStyle w:val="ListBullet"/>
       </w:pPr>
       <w:r>
-        <w:t xml:space="preserve">Premade templates and freelancers working from a brief range, as </w:t>
-      </w:r>
-      <w:r>
-        <w:rPr>
-          <w:b/>
-        </w:rPr>
-        <w:t>field practice</w:t>
-      </w:r>
-      <w:r>
-        <w:t>, from tens of dollars to a few hundred, and can look professional if the template was built for your genre.</w:t>
+        <w:t>Premade templates and freelancers working from a brief cost less than a custom designer and can look professional if the template was built for your genre.</w:t>
       </w:r>
     </w:p>
     <w:p>
@@ -4967,7 +5042,7 @@
         <w:pStyle w:val="ListBullet"/>
       </w:pPr>
       <w:r>
-        <w:t>A designer who works in your category costs more, often several hundred dollars and up, and knows the conventions without being told.</w:t>
+        <w:t>A designer who works in your category costs more and may already know the conventions.</w:t>
       </w:r>
     </w:p>
     <w:p>
@@ -5048,7 +5123,7 @@
         <w:t>.</w:t>
       </w:r>
       <w:r>
-        <w:t xml:space="preserve"> KDP gives you up to seven keywords or short phrases; KDP recommends phrases of two or three words. KDP asks you to avoid:</w:t>
+        <w:t xml:space="preserve"> KDP gives you up to seven keywords or short phrases. KDP asks you to avoid:</w:t>
       </w:r>
     </w:p>
     <w:p>
@@ -5093,7 +5168,7 @@
     </w:p>
     <w:p>
       <w:r>
-        <w:t>Misleading keywords are not a grey area; KDP states a zero-tolerance policy for metadata meant to mislead.</w:t>
+        <w:t>Misleading keywords are not a gray area; KDP states a zero-tolerance policy for metadata meant to mislead.</w:t>
       </w:r>
     </w:p>
     <w:p>
@@ -5147,19 +5222,10 @@
         <w:rPr>
           <w:b/>
         </w:rPr>
-        <w:t>Field practice.</w:t>
-      </w:r>
-      <w:r>
-        <w:t xml:space="preserve"> Many authors choose the most specific true category they can, because a book with modest sales is more visible near the top of a small category than lost in a large one, and a high place in a small category can earn a “Best Seller” badge on that category’s list. Amazon does not publish how its ranks are calculated. </w:t>
-      </w:r>
-      <w:r>
-        <w:rPr>
-          <w:b/>
-        </w:rPr>
         <w:t>Recommendation.</w:t>
       </w:r>
       <w:r>
-        <w:t xml:space="preserve"> Choose for accuracy first; a wrong shelf brings the wrong readers, and KDP does not tolerate misleading categorisation.</w:t>
+        <w:t xml:space="preserve"> Choose the most specific category that is still true: a book can be easier to see near the top of a small category than lost in a large one. Amazon does not publish how its ranks are calculated, and nothing here guarantees a badge. Choose for accuracy first; a wrong shelf brings the wrong readers, and KDP does not tolerate misleading categorization.</w:t>
       </w:r>
     </w:p>
     <w:p>
@@ -5407,7 +5473,7 @@
         <w:t>Recommendation.</w:t>
       </w:r>
       <w:r>
-        <w:t xml:space="preserve"> For most first nonfiction ebooks on Amazon.com, start between $3.99 and $6.99: inside the 70 percent band, high enough not to look slight, and low enough to be an easy decision against a felt problem. A narrow professional or technical book solving an expensive problem can test higher in the band. A first novel usually sits between $2.99 and $4.99.</w:t>
+        <w:t xml:space="preserve"> For most first nonfiction ebooks on Amazon.com, start between $3.99 and $6.99: inside the 70 percent band, high enough not to look slight, and low enough to be an easy decision against a felt problem. A narrow professional or technical book solving an expensive problem can test higher in the band. A first novel can start between $2.99 and $4.99.</w:t>
       </w:r>
     </w:p>
     <w:p>
@@ -5595,7 +5661,7 @@
         <w:pStyle w:val="ListBullet"/>
       </w:pPr>
       <w:r>
-        <w:t>Raise when proof exists, when a sequel launches, when a promotion ends, or when comparable books on your shelf have moved. Raise a dollar at a time and wait a full week before deciding again.</w:t>
+        <w:t>Raise when proof exists, when a sequel launches, when a promotion ends, or when comparable books on your shelf have moved. Raise a dollar at a time and wait the same two to four weeks before deciding again.</w:t>
       </w:r>
     </w:p>
     <w:p>
@@ -5646,10 +5712,10 @@
         <w:rPr>
           <w:b/>
         </w:rPr>
-        <w:t>Field practice.</w:t>
-      </w:r>
-      <w:r>
-        <w:t xml:space="preserve"> A concentrated launch is widely used because recent sales can improve a book’s place on Amazon’s best-seller and new-release lists, which are recalculated often. Amazon does not disclose the full ranking algorithm, so treat the size of the effect as unknown and do not pay for a launch on the promise of a ranking.</w:t>
+        <w:t>Recommendation.</w:t>
+      </w:r>
+      <w:r>
+        <w:t xml:space="preserve"> Concentrate your launch effort in one short window. Amazon does not disclose whether or how recent sales affect a book’s place on its lists, so treat any effect as unknown and do not pay for a launch on the promise of a ranking.</w:t>
       </w:r>
     </w:p>
     <w:p>
@@ -5796,7 +5862,7 @@
         </w:r>
       </w:hyperlink>
       <w:r>
-        <w:t>) gives a small burst of sales the best chance to be visible; it does not guarantee a badge.</w:t>
+        <w:t>) may make a small burst of sales easier to see; it does not guarantee a badge.</w:t>
       </w:r>
     </w:p>
     <w:p>
@@ -5836,10 +5902,10 @@
         <w:rPr>
           <w:b/>
         </w:rPr>
-        <w:t>Field practice.</w:t>
-      </w:r>
-      <w:r>
-        <w:t xml:space="preserve"> Many authors start with one automatic-targeting Sponsored Products campaign, in which Amazon chooses where to show the ad from the book’s own details. After a couple of weeks its search-term report shows which customer searches led to clicks and sales. Phrases that converted move into a manual campaign where you set each bid; phrases that spent without selling become negative keywords. The loop then repeats.</w:t>
+        <w:t>Recommendation.</w:t>
+      </w:r>
+      <w:r>
+        <w:t xml:space="preserve"> Start with one automatic-targeting Sponsored Products campaign, in which Amazon chooses where to show the ad from the book’s own details. After a couple of weeks its search-term report shows which customer searches led to clicks and sales. Phrases that converted move into a manual campaign where you set each bid; phrases that spent without selling become negative keywords. The loop then repeats.</w:t>
       </w:r>
     </w:p>
     <w:p>
@@ -6004,7 +6070,7 @@
     </w:p>
     <w:p>
       <w:r>
-        <w:t>The most common reason a first royalty payment is late or smaller than expected has nothing to do with sales: it is an incomplete tax interview. This chapter is the plumbing that makes sure the money reaches you at the rate it should.</w:t>
+        <w:t>A first royalty payment can be late or smaller than expected for reasons that have nothing to do with sales, such as an incomplete tax interview. This chapter is the plumbing that makes sure the money reaches you at the rate it should.</w:t>
       </w:r>
     </w:p>
     <w:p>
@@ -6334,7 +6400,7 @@
     </w:p>
     <w:p>
       <w:r>
-        <w:t>Going wide means selling the ebook through other retailers and library platforms, by uploading to each store yourself or through a distributor that reaches several for a share of the sales. Your income no longer depends on one platform’s rules, and some readerships buy more often elsewhere or borrow through libraries. You give up page-read income and Select’s promotions, and you manage more accounts.</w:t>
+        <w:t>Going wide means selling the ebook through other retailers and library platforms, by uploading to each store yourself or through a distributor that reaches several for a share of the sales. Your income no longer depends on one platform’s rules, and your readers may buy or borrow elsewhere, including through libraries. You give up page-read income and Select’s promotions, and you manage more accounts.</w:t>
       </w:r>
     </w:p>
     <w:p>
@@ -6403,7 +6469,7 @@
         <w:t>Worked example.</w:t>
       </w:r>
       <w:r>
-        <w:t xml:space="preserve"> A 300-page (KENP) ebook at $4.99 keeps $3.28 per sale. Suppose 300 readers in one term. If all 300 buy it, wide or in Select, the term keeps 300 × $3.28 = $984. If instead 120 of them read it in full through Kindle Unlimited at a hypothetical $0.0045 per page, the term keeps 180 × $3.28 + 120 × 300 × $0.0045 = $590.40 + $162 = $752.40. That same $752.40 is a loss or a gain depending on one fact only you can know: if those 120 would have bought the book anyway, Select cost you $984 − $752.40 = $231.60; if they would never have paid $4.99 at all, Select earned you $752.40 that wide would have earned nothing on. Select wins only if it brings readers who would not have paid $4.99 at all, and that number is exactly what one real term tells you.</w:t>
+        <w:t xml:space="preserve"> A 300-page (KENP) ebook at $4.99 keeps $3.28 per sale. Suppose 300 readers in one term. If all 300 buy it, wide or in Select, the term keeps 300 × $3.28 = $984. If instead 120 of them read it in full through Kindle Unlimited at a hypothetical $0.0045 per page, the term keeps 180 × $3.28 + 120 × 300 × $0.0045 = $590.40 + $162 = $752.40. Whether that $752.40 is a loss or a gain depends on one fact only you can know. If those 120 would have bought the book anyway, Select cost you $984 − $752.40 = $231.60. If they would never have paid $4.99, the 180 buyers pay you $590.40 either way, and Select added only the $162 in page reads. Select wins only if the page reads from readers who would not have bought outweigh the sales it displaces, and one real term shows you which it is.</w:t>
       </w:r>
     </w:p>
     <w:p>
@@ -6411,10 +6477,10 @@
         <w:rPr>
           <w:b/>
         </w:rPr>
-        <w:t>Field practice.</w:t>
-      </w:r>
-      <w:r>
-        <w:t xml:space="preserve"> Authors widely report that Kindle Unlimited matters most for fast-reading series fiction such as romance, fantasy, and thrillers, and less for many nonfiction categories. That is a pattern, not a rule, and your own term is the only evidence that counts for your book.</w:t>
+        <w:t>Test it yourself.</w:t>
+      </w:r>
+      <w:r>
+        <w:t xml:space="preserve"> Whether Kindle Unlimited suits your book depends on your genre and your readers. Your own term is the only evidence that counts.</w:t>
       </w:r>
     </w:p>
     <w:p>
@@ -6429,7 +6495,7 @@
     </w:p>
     <w:p>
       <w:r>
-        <w:t>Everything in this book so far is free and documented. That is exactly what a set of scams and shortcuts is built to hide. None of the traps below requires bad intent; most are walked into by authors who meant well.</w:t>
+        <w:t>Everything in this book so far is free and documented. That is exactly what a set of scams and shortcuts is built to hide. None of the traps below requires bad intent.</w:t>
       </w:r>
     </w:p>
     <w:p>
@@ -6442,7 +6508,7 @@
     </w:p>
     <w:p>
       <w:r>
-        <w:t>The shape repeats: a fee, from hundreds to many thousands of dollars, for things that cost nothing (an ISBN, a KDP upload, a basic conversion) or cost far less elsewhere. Warning signs:</w:t>
+        <w:t>The shape repeats: a fee for things that cost nothing (an ISBN, a KDP upload, a basic conversion) or cost far less elsewhere. Warning signs can include:</w:t>
       </w:r>
     </w:p>
     <w:p>
@@ -6600,7 +6666,7 @@
         </w:r>
       </w:hyperlink>
       <w:r>
-        <w:t>. A flood of weak books under one name also damages trust in your better books, because a reader’s next click is often “more by this author.”</w:t>
+        <w:t>. A flood of weak books under one name can also hurt your better books, because readers who dislike one may not try another.</w:t>
       </w:r>
     </w:p>
     <w:p>
@@ -6625,7 +6691,7 @@
         </w:r>
       </w:hyperlink>
       <w:r>
-        <w:t>). The second is using an image without a licence that covers commercial use in a book. Read the licence for every image, every time.</w:t>
+        <w:t>). The second is using an image without a license that covers commercial use in a book. Read the license for every image, every time.</w:t>
       </w:r>
     </w:p>
     <w:p>
@@ -6641,7 +6707,19 @@
         <w:pStyle w:val="ListBullet"/>
       </w:pPr>
       <w:r>
-        <w:t>Duplicate or near-duplicate content: the same book, or a lightly reworded version, under a new title, cover, or account. A relaunch that changes only the cover can look like this.</w:t>
+        <w:t xml:space="preserve">Undifferentiated public-domain editions: KDP does not allow them when a free version is available in its store </w:t>
+      </w:r>
+      <w:hyperlink w:anchor="note_8">
+        <w:r>
+          <w:rPr>
+            <w:color w:val="0C2D5A"/>
+            <w:u w:val="single"/>
+          </w:rPr>
+          <w:t xml:space="preserve">[8]</w:t>
+        </w:r>
+      </w:hyperlink>
+      <w:r>
+        <w:t>.</w:t>
       </w:r>
     </w:p>
     <w:p>
@@ -6690,7 +6768,7 @@
         </w:r>
       </w:hyperlink>
       <w:r>
-        <w:t>), and you have the common causes of account trouble that need no malice at all. Run them as a checklist before every launch.</w:t>
+        <w:t>), and you have several ways to get into account trouble without any malice. Run them as a checklist before every launch.</w:t>
       </w:r>
     </w:p>
     <w:p>
@@ -6703,7 +6781,7 @@
     </w:p>
     <w:p>
       <w:r>
-        <w:t xml:space="preserve">Many paid courses sell information that KDP’s own help pages give away. </w:t>
+        <w:t xml:space="preserve">Some paid courses may sell information that KDP’s own help pages give away. </w:t>
       </w:r>
       <w:r>
         <w:rPr>
@@ -6712,7 +6790,7 @@
         <w:t>Recommendation.</w:t>
       </w:r>
       <w:r>
-        <w:t xml:space="preserve"> Before paying for any course that claims to know “the algorithm,” spend twenty minutes checking whether its claims are just KDP policy with a mark-up. Amazon does not publish its ranking algorithm, so nobody can sell it to you.</w:t>
+        <w:t xml:space="preserve"> Before paying for any course that claims to know “the algorithm,” spend twenty minutes checking whether its claims are just KDP policy with a mark-up. Amazon does not publish its ranking algorithm, so a claim to know it cannot be checked.</w:t>
       </w:r>
     </w:p>
     <w:p>
@@ -6759,7 +6837,7 @@
     </w:p>
     <w:p>
       <w:r>
-        <w:t>A reader who finishes one of your books sees your others on your author page, in “more by this author,” and in Amazon’s recommendations, at no extra marketing cost. Five related books are not five separate problems of finding readers; they are one problem followed by four chances to sell again.</w:t>
+        <w:t>A reader who finishes one of your books may see your others on your author page and in “more by this author,” at no extra marketing cost. Five related books are not five separate problems of finding readers; they are one problem followed by four chances to sell again.</w:t>
       </w:r>
     </w:p>
     <w:p>
@@ -6770,10 +6848,10 @@
         <w:rPr>
           <w:b/>
         </w:rPr>
-        <w:t>Field practice.</w:t>
-      </w:r>
-      <w:r>
-        <w:t xml:space="preserve"> Authors commonly report that a second book takes less effort to launch than the first, mostly because the learning is already paid for.</w:t>
+        <w:t>Recommendation.</w:t>
+      </w:r>
+      <w:r>
+        <w:t xml:space="preserve"> Expect the second launch to need less learning than the first; the setup is already done.</w:t>
       </w:r>
     </w:p>
     <w:p>
@@ -6781,7 +6859,7 @@
         <w:rPr>
           <w:b/>
         </w:rPr>
-        <w:t>Field practice.</w:t>
+        <w:t>Worked example.</w:t>
       </w:r>
       <w:r>
         <w:t xml:space="preserve"> A beginner’s hobby guide planned from the start as three short books (getting started, common mistakes, a first big project) gives each finished book a place to send its readers, instead of waiting years for one large volume. An author running two unrelated lines, say cozy mysteries and regional cookbooks, spreads risk instead: a slow month in one category does not empty the other. Both apply the same principle to different situations.</w:t>
@@ -6831,7 +6909,19 @@
     </w:p>
     <w:p>
       <w:r>
-        <w:t>ACX is Amazon’s audiobook platform, distributing to Audible, Amazon, and Apple Books. There are three ways to get a finished audiobook there:</w:t>
+        <w:t xml:space="preserve">ACX is Amazon’s audiobook platform, distributing to Audible, Amazon, and Apple Books </w:t>
+      </w:r>
+      <w:hyperlink w:anchor="note_32">
+        <w:r>
+          <w:rPr>
+            <w:color w:val="0C2D5A"/>
+            <w:u w:val="single"/>
+          </w:rPr>
+          <w:t xml:space="preserve">[32]</w:t>
+        </w:r>
+      </w:hyperlink>
+      <w:r>
+        <w:t>. There are three ways to get a finished audiobook there:</w:t>
       </w:r>
     </w:p>
     <w:p>
@@ -6871,33 +6961,74 @@
     </w:p>
     <w:p>
       <w:r>
-        <w:t>KDP also offers audiobooks with virtual voice, a beta that turns eligible ebooks into AI-narrated audio at little cost; check your KDP account for eligibility before planning around it. ACX pays more for exclusive distribution than non-exclusive; check ACX’s current royalty table before you choose, because it has changed before.</w:t>
-      </w:r>
-    </w:p>
-    <w:p>
-      <w:r>
-        <w:t>Not every book belongs in audio. A book that leans on charts and worked numbers, like this one, loses much of its value without the page. Narrative nonfiction, memoir, and fiction do not.</w:t>
-      </w:r>
-    </w:p>
-    <w:p>
-      <w:bookmarkStart w:id="45" w:name="ch_31"/>
-      <w:pPr>
-        <w:pStyle w:val="Heading2"/>
-      </w:pPr>
-      <w:r>
-        <w:t>Chapter 31: A Realistic First-Year Plan</w:t>
-      </w:r>
-      <w:bookmarkEnd w:id="45"/>
-    </w:p>
-    <w:p>
-      <w:r>
         <w:rPr>
           <w:b/>
         </w:rPr>
-        <w:t>Field practice.</w:t>
-      </w:r>
-      <w:r>
-        <w:t xml:space="preserve"> Self-publishing income is very uneven. A small share of books and authors earn well, and a large share earn little or do not cover their costs. Nothing in this book changes that distribution. What it can change is your odds within it, by doing the plain, checkable work: real editing, an accurate category, honest reviews, capped spending, and a second book.</w:t>
+        <w:t xml:space="preserve">Platform rule </w:t>
+      </w:r>
+      <w:hyperlink w:anchor="note_33">
+        <w:r>
+          <w:rPr>
+            <w:color w:val="0C2D5A"/>
+            <w:u w:val="single"/>
+            <w:b/>
+          </w:rPr>
+          <w:t xml:space="preserve">[33]</w:t>
+        </w:r>
+      </w:hyperlink>
+      <w:r>
+        <w:rPr>
+          <w:b/>
+        </w:rPr>
+        <w:t>.</w:t>
+      </w:r>
+      <w:r>
+        <w:t xml:space="preserve"> KDP offers audiobooks with virtual voice as an invite-only beta for eligible ebooks; check your KDP account for eligibility before planning around it. </w:t>
+      </w:r>
+      <w:r>
+        <w:rPr>
+          <w:b/>
+        </w:rPr>
+        <w:t xml:space="preserve">Platform rule </w:t>
+      </w:r>
+      <w:hyperlink w:anchor="note_32">
+        <w:r>
+          <w:rPr>
+            <w:color w:val="0C2D5A"/>
+            <w:u w:val="single"/>
+            <w:b/>
+          </w:rPr>
+          <w:t xml:space="preserve">[32]</w:t>
+        </w:r>
+      </w:hyperlink>
+      <w:r>
+        <w:rPr>
+          <w:b/>
+        </w:rPr>
+        <w:t>.</w:t>
+      </w:r>
+      <w:r>
+        <w:t xml:space="preserve"> ACX pays a higher royalty for exclusive distribution than for non-exclusive: 40 percent against 25 percent on its legacy model, and 50 percent against 30 percent on its new model, which applies to newly claimed titles from 26 May 2026 and to all titles after 2026. In a royalty-share deal the exclusive rate is split equally with the narrator. Check ACX’s current table before you choose.</w:t>
+      </w:r>
+    </w:p>
+    <w:p>
+      <w:r>
+        <w:t>Not every book belongs in audio. A book that leans on charts and worked numbers, like this one, loses much of its value without the page. Narrative nonfiction, memoir, and fiction do not.</w:t>
+      </w:r>
+    </w:p>
+    <w:p>
+      <w:bookmarkStart w:id="45" w:name="ch_31"/>
+      <w:pPr>
+        <w:pStyle w:val="Heading2"/>
+      </w:pPr>
+      <w:r>
+        <w:t>Chapter 31: A Realistic First-Year Plan</w:t>
+      </w:r>
+      <w:bookmarkEnd w:id="45"/>
+    </w:p>
+    <w:p>
+      <w:r>
+        <w:t>This book cannot predict what a first book will earn. What it can do is help you do the plain, checkable work: real editing, an accurate category, honest reviews, capped spending, and a second book.</w:t>
       </w:r>
     </w:p>
     <w:p>
@@ -6998,7 +7129,7 @@
           </w:tcPr>
           <w:p>
             <w:r>
-              <w:t>18, 2</w:t>
+              <w:t>19, 2</w:t>
             </w:r>
           </w:p>
         </w:tc>
@@ -7030,7 +7161,7 @@
           </w:tcPr>
           <w:p>
             <w:r>
-              <w:t>19, 21, 7</w:t>
+              <w:t>20, 22, 7</w:t>
             </w:r>
           </w:p>
         </w:tc>
@@ -7062,7 +7193,7 @@
           </w:tcPr>
           <w:p>
             <w:r>
-              <w:t>20, 22, 23, 24</w:t>
+              <w:t>21, 23, 24, 25</w:t>
             </w:r>
           </w:p>
         </w:tc>
@@ -7094,7 +7225,7 @@
           </w:tcPr>
           <w:p>
             <w:r>
-              <w:t>9, 25, 26, 27</w:t>
+              <w:t>9, 26, 27, 28</w:t>
             </w:r>
           </w:p>
         </w:tc>
@@ -7126,7 +7257,7 @@
           </w:tcPr>
           <w:p>
             <w:r>
-              <w:t>10, 29</w:t>
+              <w:t>10, 30</w:t>
             </w:r>
           </w:p>
         </w:tc>
@@ -7202,16 +7333,7 @@
     </w:p>
     <w:p>
       <w:r>
-        <w:t xml:space="preserve">A book with an empty review section asks every stranger to be the first to trust it. </w:t>
-      </w:r>
-      <w:r>
-        <w:rPr>
-          <w:b/>
-        </w:rPr>
-        <w:t>Field practice.</w:t>
-      </w:r>
-      <w:r>
-        <w:t xml:space="preserve"> Many authors find that ads and paid promotions perform poorly on pages with no reviews, and many promotional newsletters require a minimum number of reviews before they will feature a book. Amazon does not publish whether or how review count affects ranking, and this book does not guess. The case does not need a hidden formula: shoppers see the empty section, newsletter editors use it as a gate, and conversion is what turns paid clicks into kept money (</w:t>
+        <w:t>A book with an empty review section asks every stranger to be the first to trust it. Amazon does not publish whether or how review count affects ranking, and this book does not guess. The case does not need a hidden formula: shoppers can see an empty review section, some promotional newsletters ask for a minimum number of reviews (check each one’s terms), and conversion is what turns paid clicks into kept money (</w:t>
       </w:r>
       <w:hyperlink w:anchor="ch_9">
         <w:r>
@@ -7236,19 +7358,10 @@
         <w:rPr>
           <w:b/>
         </w:rPr>
-        <w:t>Field practice.</w:t>
-      </w:r>
-      <w:r>
-        <w:t xml:space="preserve"> Free days on KDP Select tend to produce downloads rather than reviews. A small group of readers who applied to read the book in its genre is a different population. Authors who count report much higher posting rates from such a group than from anonymous free downloads, but no published study gives a figure you can plan on. </w:t>
-      </w:r>
-      <w:r>
-        <w:rPr>
-          <w:b/>
-        </w:rPr>
         <w:t>Test it yourself.</w:t>
       </w:r>
       <w:r>
-        <w:t xml:space="preserve"> Count invitations sent, files opened, and reviews posted for your own first campaign, and plan the second from that.</w:t>
+        <w:t xml:space="preserve"> Free days on KDP Select produce downloads; whether any become reviews, and whether a small group of readers who applied to read the book does better, only your own counts can show. Count invitations sent, files opened, and reviews posted for your first campaign, and plan the second from that.</w:t>
       </w:r>
     </w:p>
     <w:p>
@@ -7496,7 +7609,7 @@
         <w:t>Field practice.</w:t>
       </w:r>
       <w:r>
-        <w:t xml:space="preserve"> Delivery services such as BookFunnel exist so that you do not have to teach this to each reader. Reader-matching services such as BookSirens or Booksprout can supply readers when you have no list; NetGalley reaches librarians and reviewers. They sell downloads by interested readers, not reviews, and a review must stay optional. </w:t>
+        <w:t xml:space="preserve"> Delivery services such as BookFunnel exist so that you do not have to teach this to each reader. BookSirens, Booksprout, and NetGalley are examples of services that connect authors with readers; read each one’s terms, and remember that a review must stay optional. </w:t>
       </w:r>
       <w:r>
         <w:rPr>
@@ -7567,7 +7680,7 @@
         <w:t>Recommendation.</w:t>
       </w:r>
       <w:r>
-        <w:t xml:space="preserve"> Do not reply. A public reply stays under the review and usually reads worse than the review. If the review names a real fault, such as a broken table or a missing chapter, fix the file; that helps every later reader. A page of nothing but praise can look as if nobody felt free to be honest, so recruit for honest reactions, not unanimous ones.</w:t>
+        <w:t xml:space="preserve"> Do not reply. A public reply stays under the review and can read worse than the review. If the review names a real fault, such as a broken table or a missing chapter, fix the file; that helps every later reader. A page of nothing but praise may look as if nobody felt free to be honest, so recruit for honest reactions, not unanimous ones.</w:t>
       </w:r>
     </w:p>
     <w:p>
@@ -7764,7 +7877,7 @@
         <w:pStyle w:val="ListBullet"/>
       </w:pPr>
       <w:r>
-        <w:t>That free days produce reviews. They produce downloads.</w:t>
+        <w:t>That free days produce reviews. They produce downloads; count whether any turn into reviews.</w:t>
       </w:r>
     </w:p>
     <w:p>
@@ -7772,7 +7885,7 @@
         <w:pStyle w:val="ListBullet"/>
       </w:pPr>
       <w:r>
-        <w:t>That a hundred reviews are needed before anyone buys. The costly gap is zero.</w:t>
+        <w:t>That a hundred reviews are needed before anyone buys. This book names no number; its point is only that an empty review section is a gap you can close honestly.</w:t>
       </w:r>
     </w:p>
     <w:p>
@@ -7898,7 +8011,7 @@
         <w:pStyle w:val="ListBullet"/>
       </w:pPr>
       <w:r>
-        <w:t>Research support: explaining a concept, testing your understanding, or summarising your own notes, after which you write the explanation yourself.</w:t>
+        <w:t>Research support: explaining a concept, testing your understanding, or summarizing your own notes, after which you write the explanation yourself.</w:t>
       </w:r>
     </w:p>
     <w:p>
@@ -8081,12 +8194,12 @@
     </w:p>
     <w:p>
       <w:r>
-        <w:t>That does not leave AI-assisted books unprotected. The same ruling says the requirement does not bar works made with the help of AI; what counts is the human contribution. Your own sentences are yours, and so are your creative selection, arrangement, and changes. In its January 2025 report on copyrightability, the Copyright Office concluded that prompts alone, however detailed, do not make you the author of what comes back. How much human shaping turns AI material into your work is still being argued, so do not plan a business around the generous end of that line. Other countries draw it differently; the United Kingdom, for one, has a separate rule for computer-generated works.</w:t>
-      </w:r>
-    </w:p>
-    <w:p>
-      <w:r>
-        <w:t>An AI service’s terms typically say the output is yours to use. That is permission, not ownership: the company promises not to claim the text against you, but it cannot give you a copyright the law says does not exist. You may publish the output; you cannot stop others from copying the parts no human wrote.</w:t>
+        <w:t>That does not leave AI-assisted books unprotected. The same ruling says the requirement does not bar works made with the help of AI; what counts is the human contribution. Your own sentences are yours, and so are your creative selection, arrangement, and changes. In its January 2025 report on copyrightability, the Copyright Office concluded that prompts alone, however detailed, do not make you the author of what comes back. How much human shaping turns AI material into your work is still being argued, so do not plan a business around the generous end of that line. Other countries draw it differently.</w:t>
+      </w:r>
+    </w:p>
+    <w:p>
+      <w:r>
+        <w:t>An AI service’s terms may say the output is yours to use. That is permission, not ownership: the company promises not to claim the text against you, but it cannot give you a copyright the law says does not exist. You may publish the output; you cannot stop others from copying the parts no human wrote.</w:t>
       </w:r>
     </w:p>
     <w:p>
@@ -8149,7 +8262,7 @@
     </w:p>
     <w:p>
       <w:r>
-        <w:t xml:space="preserve">The audit step is the tell. Legitimate research has no reason to scrub a manuscript against a short list of specific books; that step exists because the process expects resemblance and is built to hide it. Facts and ideas are not protected by copyright, but an author’s expression of them, including wording, analogies, and structure, is </w:t>
+        <w:t xml:space="preserve">The audit step is the tell. Legitimate research has no reason to scrub a manuscript against a short list of specific books; a step whose only job is to remove detectable resemblance suggests that resemblance is expected. Facts and ideas are not protected by copyright, but an author’s expression of them, including wording, analogies, and structure, is </w:t>
       </w:r>
       <w:hyperlink w:anchor="note_25">
         <w:r>
@@ -8161,7 +8274,7 @@
         </w:r>
       </w:hyperlink>
       <w:r>
-        <w:t>. A workflow whose last step erases detectable similarity to particular copyrighted books produces a derivative work dressed to pass inspection, and “an AI tool did the condensing” is no defence. It also puts the whole account at risk (</w:t>
+        <w:t>. A workflow whose last step erases detectable similarity to particular copyrighted books produces a derivative work dressed to pass inspection, and “an AI tool did the condensing” does not by itself make it lawful (see below). It could also put the whole account at risk (</w:t>
       </w:r>
       <w:hyperlink w:anchor="ch_29">
         <w:r>
@@ -8306,7 +8419,7 @@
     </w:p>
     <w:p>
       <w:r>
-        <w:t>There are two legitimate ways to build directly on someone else’s work: get a licence from the rights holder, or adapt a work that is verifiably in the public domain in every country where you will sell. Duration rules vary by country, and a modern translation, introduction, annotations, or cover art on an old edition can carry their own copyright. Verify the exact edition, and every layer of it, before you build on it.</w:t>
+        <w:t>There are two legitimate ways to build directly on someone else’s work: get a license from the rights holder, or adapt a work that is verifiably in the public domain in every country where you will sell. Duration rules vary by country, and a modern translation, introduction, annotations, or cover art on an old edition can carry their own copyright. Verify the exact edition, and every layer of it, before you build on it.</w:t>
       </w:r>
     </w:p>
     <w:p>
@@ -8329,7 +8442,7 @@
     </w:p>
     <w:p>
       <w:r>
-        <w:t>Nothing in this book is complicated on its own. Royalty maths is arithmetic. Keyword slots are a form field. A launch is a calendar with the same events moved closer together. What makes self-publishing hard is that every step lands on one person, and it is tempting to skip the unglamorous ones (a real editing pass, an honest category, the tax interview) in favour of the exciting one: pressing Publish.</w:t>
+        <w:t>Nothing in this book is complicated on its own. Royalty math is arithmetic. Keyword slots are a form field. A launch is a calendar with the same events moved closer together. What makes self-publishing hard is that every step lands on one person, and it is tempting to skip the unglamorous ones (a real editing pass, an honest category, the tax interview) in favor of the exciting one: pressing Publish.</w:t>
       </w:r>
     </w:p>
     <w:p>
@@ -8669,7 +8782,7 @@
         <w:t xml:space="preserve">☐ </w:t>
       </w:r>
       <w:r>
-        <w:t>KDP Select enrolment, and its renewal date, decided on purpose (</w:t>
+        <w:t>KDP Select enrollment, and its renewal date, decided on purpose (</w:t>
       </w:r>
       <w:hyperlink w:anchor="ch_28">
         <w:r>
@@ -8723,13 +8836,13 @@
       <w:r>
         <w:t xml:space="preserve">, and </w:t>
       </w:r>
-      <w:hyperlink w:anchor="ch_31">
+      <w:hyperlink w:anchor="ch_32">
         <w:r>
           <w:rPr>
             <w:color w:val="0C2D5A"/>
             <w:u w:val="single"/>
           </w:rPr>
-          <w:t xml:space="preserve">31</w:t>
+          <w:t xml:space="preserve">32</w:t>
         </w:r>
       </w:hyperlink>
       <w:r>
@@ -9359,7 +9472,7 @@
         </w:r>
       </w:hyperlink>
       <w:r>
-        <w:t xml:space="preserve"> asks you to pick three of these: one price, one next book, one format or extra. Run each through the same four steps:</w:t>
+        <w:t xml:space="preserve"> asks you to pick three of these, each from a different section. Run each through the same four steps:</w:t>
       </w:r>
     </w:p>
     <w:p>
@@ -10187,7 +10300,7 @@
     </w:p>
     <w:p>
       <w:r>
-        <w:t>Leave these for later: merchandise, paid fan clubs, and large courses with no audience. They add work and rarely add a keep until strangers already want the book.</w:t>
+        <w:t>Leave these for later: merchandise, paid fan clubs, and large courses with no audience. They add work, and none has a keep you can write down until strangers already want the book.</w:t>
       </w:r>
     </w:p>
     <w:p>
@@ -10372,7 +10485,7 @@
     </w:p>
     <w:p>
       <w:r>
-        <w:t xml:space="preserve">KDP Select. A 90-day, ebook-only exclusive enrolment that adds Kindle Unlimited and promotions. </w:t>
+        <w:t xml:space="preserve">KDP Select. A 90-day, ebook-only exclusive enrollment that adds Kindle Unlimited and promotions. </w:t>
       </w:r>
       <w:hyperlink w:anchor="ch_28">
         <w:r>
@@ -10389,6 +10502,52 @@
     </w:p>
     <w:p>
       <w:r>
+        <w:t xml:space="preserve">Negative keyword. A search term you tell the ad system never to show your ad for. </w:t>
+      </w:r>
+      <w:hyperlink w:anchor="ch_26">
+        <w:r>
+          <w:rPr>
+            <w:color w:val="0C2D5A"/>
+            <w:u w:val="single"/>
+          </w:rPr>
+          <w:t xml:space="preserve">Chapter 26</w:t>
+        </w:r>
+      </w:hyperlink>
+      <w:r>
+        <w:t>.</w:t>
+      </w:r>
+    </w:p>
+    <w:p>
+      <w:r>
+        <w:t xml:space="preserve">Read-through. The share of readers of one book who go on to buy the next. </w:t>
+      </w:r>
+      <w:hyperlink w:anchor="ch_10">
+        <w:r>
+          <w:rPr>
+            <w:color w:val="0C2D5A"/>
+            <w:u w:val="single"/>
+          </w:rPr>
+          <w:t xml:space="preserve">Chapters 10</w:t>
+        </w:r>
+      </w:hyperlink>
+      <w:r>
+        <w:t xml:space="preserve"> and </w:t>
+      </w:r>
+      <w:hyperlink w:anchor="ch_24">
+        <w:r>
+          <w:rPr>
+            <w:color w:val="0C2D5A"/>
+            <w:u w:val="single"/>
+          </w:rPr>
+          <w:t xml:space="preserve">24</w:t>
+        </w:r>
+      </w:hyperlink>
+      <w:r>
+        <w:t>.</w:t>
+      </w:r>
+    </w:p>
+    <w:p>
+      <w:r>
         <w:t xml:space="preserve">Seventy percent band. On Amazon.com, list prices from $2.99 to $12.99 where the 70 percent royalty can apply. The top was $9.99 until 7 July 2026. </w:t>
       </w:r>
       <w:hyperlink w:anchor="ch_3">
@@ -10406,6 +10565,35 @@
     </w:p>
     <w:p>
       <w:r>
+        <w:t xml:space="preserve">Sponsored Products. Amazon’s pay-per-click ads for individual books. </w:t>
+      </w:r>
+      <w:hyperlink w:anchor="ch_9">
+        <w:r>
+          <w:rPr>
+            <w:color w:val="0C2D5A"/>
+            <w:u w:val="single"/>
+          </w:rPr>
+          <w:t xml:space="preserve">Chapters 9</w:t>
+        </w:r>
+      </w:hyperlink>
+      <w:r>
+        <w:t xml:space="preserve"> and </w:t>
+      </w:r>
+      <w:hyperlink w:anchor="ch_26">
+        <w:r>
+          <w:rPr>
+            <w:color w:val="0C2D5A"/>
+            <w:u w:val="single"/>
+          </w:rPr>
+          <w:t xml:space="preserve">26</w:t>
+        </w:r>
+      </w:hyperlink>
+      <w:r>
+        <w:t>.</w:t>
+      </w:r>
+    </w:p>
+    <w:p>
+      <w:r>
         <w:t xml:space="preserve">Thumbnail test. Whether the title can be read when the cover is shown tiny. </w:t>
       </w:r>
       <w:hyperlink w:anchor="ch_5">
@@ -10450,7 +10638,55 @@
     </w:p>
     <w:p>
       <w:r>
-        <w:t>Every note was checked on 3 October 2026. Platform pages change; look again before you act. Worked examples, field practice, and recommendations in this book are not Amazon rules and are not sourced to these pages.</w:t>
+        <w:t xml:space="preserve">Notes </w:t>
+      </w:r>
+      <w:hyperlink w:anchor="note_1">
+        <w:r>
+          <w:rPr>
+            <w:color w:val="0C2D5A"/>
+            <w:u w:val="single"/>
+          </w:rPr>
+          <w:t xml:space="preserve">[1]</w:t>
+        </w:r>
+      </w:hyperlink>
+      <w:r>
+        <w:t xml:space="preserve"> to </w:t>
+      </w:r>
+      <w:hyperlink w:anchor="note_30">
+        <w:r>
+          <w:rPr>
+            <w:color w:val="0C2D5A"/>
+            <w:u w:val="single"/>
+          </w:rPr>
+          <w:t xml:space="preserve">[30]</w:t>
+        </w:r>
+      </w:hyperlink>
+      <w:r>
+        <w:t xml:space="preserve"> were checked on 3 October 2026; notes </w:t>
+      </w:r>
+      <w:hyperlink w:anchor="note_31">
+        <w:r>
+          <w:rPr>
+            <w:color w:val="0C2D5A"/>
+            <w:u w:val="single"/>
+          </w:rPr>
+          <w:t xml:space="preserve">[31]</w:t>
+        </w:r>
+      </w:hyperlink>
+      <w:r>
+        <w:t xml:space="preserve"> to </w:t>
+      </w:r>
+      <w:hyperlink w:anchor="note_33">
+        <w:r>
+          <w:rPr>
+            <w:color w:val="0C2D5A"/>
+            <w:u w:val="single"/>
+          </w:rPr>
+          <w:t xml:space="preserve">[33]</w:t>
+        </w:r>
+      </w:hyperlink>
+      <w:r>
+        <w:t xml:space="preserve"> on 6 October 2026. Platform pages change; look again before you act. Worked examples, field practice, and recommendations in this book are not Amazon rules and are not sourced to these pages.</w:t>
       </w:r>
     </w:p>
     <w:p>
@@ -11054,14 +11290,71 @@
       </w:hyperlink>
     </w:p>
     <w:p>
-      <w:bookmarkStart w:id="87" w:name="h_about_the_author"/>
+      <w:bookmarkStart w:id="87" w:name="note_31"/>
+      <w:r>
+        <w:t xml:space="preserve">[31] </w:t>
+      </w:r>
+      <w:bookmarkEnd w:id="87"/>
+      <w:r>
+        <w:t xml:space="preserve">Amazon KDP Help, “Timelines.” </w:t>
+      </w:r>
+      <w:hyperlink r:id="rId52">
+        <w:r>
+          <w:rPr>
+            <w:color w:val="0C2D5A"/>
+            <w:u w:val="single"/>
+          </w:rPr>
+          <w:t xml:space="preserve">https://kdp.amazon.com/en_US/help/topic/G202173620</w:t>
+        </w:r>
+      </w:hyperlink>
+    </w:p>
+    <w:p>
+      <w:bookmarkStart w:id="88" w:name="note_32"/>
+      <w:r>
+        <w:t xml:space="preserve">[32] </w:t>
+      </w:r>
+      <w:bookmarkEnd w:id="88"/>
+      <w:r>
+        <w:t xml:space="preserve">ACX Help, “How royalties work.” </w:t>
+      </w:r>
+      <w:hyperlink r:id="rId53">
+        <w:r>
+          <w:rPr>
+            <w:color w:val="0C2D5A"/>
+            <w:u w:val="single"/>
+          </w:rPr>
+          <w:t xml:space="preserve">https://help.acx.com/s/article/how-royalties-work</w:t>
+        </w:r>
+      </w:hyperlink>
+    </w:p>
+    <w:p>
+      <w:bookmarkStart w:id="89" w:name="note_33"/>
+      <w:r>
+        <w:t xml:space="preserve">[33] </w:t>
+      </w:r>
+      <w:bookmarkEnd w:id="89"/>
+      <w:r>
+        <w:t xml:space="preserve">Amazon KDP Help, “Audiobooks with virtual voice eligibility and troubleshooting.” </w:t>
+      </w:r>
+      <w:hyperlink r:id="rId54">
+        <w:r>
+          <w:rPr>
+            <w:color w:val="0C2D5A"/>
+            <w:u w:val="single"/>
+          </w:rPr>
+          <w:t xml:space="preserve">https://kdp.amazon.com/en_US/help/topic/GJSXT4GZLP4PL62B</w:t>
+        </w:r>
+      </w:hyperlink>
+    </w:p>
+    <w:p>
+      <w:bookmarkStart w:id="90" w:name="h_about_the_author"/>
       <w:pPr>
         <w:pStyle w:val="Heading1"/>
       </w:pPr>
       <w:r>
         <w:t>About the Author</w:t>
       </w:r>
-      <w:bookmarkEnd w:id="87"/>
+      <w:bookmarkEnd w:id="90"/>
     </w:p>
     <w:p>
       <w:r>
@@ -11079,14 +11372,14 @@
       </w:r>
     </w:p>
     <w:p>
-      <w:bookmarkStart w:id="88" w:name="h_also_by_kevin_drew_peters"/>
+      <w:bookmarkStart w:id="91" w:name="h_also_by_kevin_drew_peters"/>
       <w:pPr>
         <w:pStyle w:val="Heading1"/>
       </w:pPr>
       <w:r>
         <w:t>Also by Kevin Drew Peters</w:t>
       </w:r>
-      <w:bookmarkEnd w:id="88"/>
+      <w:bookmarkEnd w:id="91"/>
     </w:p>
     <w:p>
       <w:r>

</xml_diff>